<commit_message>
conexão front com razor
</commit_message>
<xml_diff>
--- a/ApiWeb/bin/Debug/net8.0/Modelos/ESQUELETO.docx
+++ b/ApiWeb/bin/Debug/net8.0/Modelos/ESQUELETO.docx
@@ -487,20 +487,401 @@
     <w:p>
       <w:pPr>
         <w:pStyle w:val="Normal"/>
+        <w:numPr>
+          <w:ilvl w:val="0"/>
+          <w:numId w:val="1"/>
+        </w:numPr>
         <w:spacing w:lineRule="auto" w:line="360"/>
         <w:rPr>
-          <w:rFonts w:ascii="Arial" w:hAnsi="Arial" w:cs="Arial"/>
-          <w:b/>
-          <w:bCs/>
-        </w:rPr>
-      </w:pPr>
-      <w:r>
-        <w:rPr>
-          <w:rFonts w:cs="Arial" w:ascii="Arial" w:hAnsi="Arial"/>
-          <w:b/>
-          <w:bCs/>
-        </w:rPr>
-        <w:t xml:space="preserve">1. IDENTIFICAÇÃO DO PROCESSO................................................................ </w:t>
+          <w:sz w:val="20"/>
+          <w:szCs w:val="20"/>
+        </w:rPr>
+      </w:pPr>
+      <w:r>
+        <w:rPr>
+          <w:rFonts w:cs="Arial" w:ascii="Arial" w:hAnsi="Arial"/>
+          <w:b/>
+          <w:bCs/>
+          <w:sz w:val="20"/>
+          <w:szCs w:val="20"/>
+        </w:rPr>
+        <w:t>IDENTIFICAÇÃO DO PROCESSO.............................................................…</w:t>
+      </w:r>
+    </w:p>
+    <w:p>
+      <w:pPr>
+        <w:pStyle w:val="Normal"/>
+        <w:numPr>
+          <w:ilvl w:val="0"/>
+          <w:numId w:val="1"/>
+        </w:numPr>
+        <w:spacing w:lineRule="auto" w:line="360"/>
+        <w:rPr>
+          <w:sz w:val="20"/>
+          <w:szCs w:val="20"/>
+        </w:rPr>
+      </w:pPr>
+      <w:r>
+        <w:rPr>
+          <w:rFonts w:cs="Arial" w:ascii="Arial" w:hAnsi="Arial"/>
+          <w:b/>
+          <w:bCs/>
+          <w:sz w:val="20"/>
+          <w:szCs w:val="20"/>
+        </w:rPr>
+        <w:t>QUALIFICAÇÃO DO PERITO........................................................................</w:t>
+      </w:r>
+    </w:p>
+    <w:p>
+      <w:pPr>
+        <w:pStyle w:val="Normal"/>
+        <w:numPr>
+          <w:ilvl w:val="0"/>
+          <w:numId w:val="1"/>
+        </w:numPr>
+        <w:spacing w:lineRule="auto" w:line="360"/>
+        <w:rPr>
+          <w:sz w:val="20"/>
+          <w:szCs w:val="20"/>
+        </w:rPr>
+      </w:pPr>
+      <w:r>
+        <w:rPr>
+          <w:rFonts w:cs="Arial" w:ascii="Arial" w:hAnsi="Arial"/>
+          <w:b/>
+          <w:bCs/>
+          <w:sz w:val="20"/>
+          <w:szCs w:val="20"/>
+        </w:rPr>
+        <w:t xml:space="preserve">  </w:t>
+      </w:r>
+      <w:r>
+        <w:rPr>
+          <w:rFonts w:cs="Arial" w:ascii="Arial" w:hAnsi="Arial"/>
+          <w:b/>
+          <w:bCs/>
+          <w:sz w:val="20"/>
+          <w:szCs w:val="20"/>
+        </w:rPr>
+        <w:t xml:space="preserve">FUNDAMENTAÇÃO LEGAL E TÉCNICA..................................................... </w:t>
+      </w:r>
+    </w:p>
+    <w:p>
+      <w:pPr>
+        <w:pStyle w:val="Normal"/>
+        <w:numPr>
+          <w:ilvl w:val="0"/>
+          <w:numId w:val="1"/>
+        </w:numPr>
+        <w:spacing w:lineRule="auto" w:line="360"/>
+        <w:rPr>
+          <w:sz w:val="20"/>
+          <w:szCs w:val="20"/>
+        </w:rPr>
+      </w:pPr>
+      <w:r>
+        <w:rPr>
+          <w:rFonts w:cs="Arial" w:ascii="Arial" w:hAnsi="Arial"/>
+          <w:b/>
+          <w:bCs/>
+          <w:sz w:val="20"/>
+          <w:szCs w:val="20"/>
+        </w:rPr>
+        <w:t xml:space="preserve"> </w:t>
+      </w:r>
+      <w:r>
+        <w:rPr>
+          <w:rFonts w:cs="Arial" w:ascii="Arial" w:hAnsi="Arial"/>
+          <w:b/>
+          <w:bCs/>
+          <w:sz w:val="20"/>
+          <w:szCs w:val="20"/>
+        </w:rPr>
+        <w:t xml:space="preserve">OBJETO DA PERÍCIA ................................................................................... </w:t>
+      </w:r>
+    </w:p>
+    <w:p>
+      <w:pPr>
+        <w:pStyle w:val="Normal"/>
+        <w:numPr>
+          <w:ilvl w:val="0"/>
+          <w:numId w:val="1"/>
+        </w:numPr>
+        <w:spacing w:lineRule="auto" w:line="360"/>
+        <w:rPr>
+          <w:sz w:val="20"/>
+          <w:szCs w:val="20"/>
+        </w:rPr>
+      </w:pPr>
+      <w:r>
+        <w:rPr>
+          <w:rFonts w:cs="Arial" w:ascii="Arial" w:hAnsi="Arial"/>
+          <w:b/>
+          <w:bCs/>
+          <w:sz w:val="20"/>
+          <w:szCs w:val="20"/>
+        </w:rPr>
+        <w:t xml:space="preserve"> </w:t>
+      </w:r>
+      <w:r>
+        <w:rPr>
+          <w:rFonts w:cs="Arial" w:ascii="Arial" w:hAnsi="Arial"/>
+          <w:b/>
+          <w:bCs/>
+          <w:sz w:val="20"/>
+          <w:szCs w:val="20"/>
+        </w:rPr>
+        <w:t xml:space="preserve">METODOLOGIA UTILIZADA......................................................................... </w:t>
+      </w:r>
+    </w:p>
+    <w:p>
+      <w:pPr>
+        <w:pStyle w:val="Normal"/>
+        <w:numPr>
+          <w:ilvl w:val="0"/>
+          <w:numId w:val="1"/>
+        </w:numPr>
+        <w:spacing w:lineRule="auto" w:line="360"/>
+        <w:rPr>
+          <w:sz w:val="20"/>
+          <w:szCs w:val="20"/>
+        </w:rPr>
+      </w:pPr>
+      <w:r>
+        <w:rPr>
+          <w:rFonts w:cs="Arial" w:ascii="Arial" w:hAnsi="Arial"/>
+          <w:b/>
+          <w:bCs/>
+          <w:sz w:val="20"/>
+          <w:szCs w:val="20"/>
+        </w:rPr>
+        <w:t xml:space="preserve"> </w:t>
+      </w:r>
+      <w:r>
+        <w:rPr>
+          <w:rFonts w:cs="Arial" w:ascii="Arial" w:hAnsi="Arial"/>
+          <w:b/>
+          <w:bCs/>
+          <w:sz w:val="20"/>
+          <w:szCs w:val="20"/>
+        </w:rPr>
+        <w:t xml:space="preserve">PRESENTES À DILIGÊNCIA PERICIAL ....................................................... </w:t>
+      </w:r>
+    </w:p>
+    <w:p>
+      <w:pPr>
+        <w:pStyle w:val="Normal"/>
+        <w:numPr>
+          <w:ilvl w:val="0"/>
+          <w:numId w:val="1"/>
+        </w:numPr>
+        <w:spacing w:lineRule="auto" w:line="360"/>
+        <w:rPr>
+          <w:sz w:val="20"/>
+          <w:szCs w:val="20"/>
+        </w:rPr>
+      </w:pPr>
+      <w:r>
+        <w:rPr>
+          <w:rFonts w:cs="Arial" w:ascii="Arial" w:hAnsi="Arial"/>
+          <w:b/>
+          <w:bCs/>
+          <w:sz w:val="20"/>
+          <w:szCs w:val="20"/>
+        </w:rPr>
+        <w:t xml:space="preserve">AMBIENTE DE TRABALHO DA RECLAMANTE........................................... </w:t>
+      </w:r>
+    </w:p>
+    <w:p>
+      <w:pPr>
+        <w:pStyle w:val="Normal"/>
+        <w:numPr>
+          <w:ilvl w:val="0"/>
+          <w:numId w:val="1"/>
+        </w:numPr>
+        <w:spacing w:lineRule="auto" w:line="360"/>
+        <w:rPr>
+          <w:sz w:val="20"/>
+          <w:szCs w:val="20"/>
+        </w:rPr>
+      </w:pPr>
+      <w:r>
+        <w:rPr>
+          <w:rFonts w:cs="Arial" w:ascii="Arial" w:hAnsi="Arial"/>
+          <w:b/>
+          <w:bCs/>
+          <w:sz w:val="20"/>
+          <w:szCs w:val="20"/>
+        </w:rPr>
+        <w:t xml:space="preserve">DESCRIÇÃO DAS ATIVIDADES DA RECLAMANTE.................................... </w:t>
+      </w:r>
+    </w:p>
+    <w:p>
+      <w:pPr>
+        <w:pStyle w:val="Normal"/>
+        <w:numPr>
+          <w:ilvl w:val="0"/>
+          <w:numId w:val="1"/>
+        </w:numPr>
+        <w:spacing w:lineRule="auto" w:line="360"/>
+        <w:rPr>
+          <w:sz w:val="20"/>
+          <w:szCs w:val="20"/>
+        </w:rPr>
+      </w:pPr>
+      <w:r>
+        <w:rPr>
+          <w:rFonts w:cs="Arial" w:ascii="Arial" w:hAnsi="Arial"/>
+          <w:b/>
+          <w:bCs/>
+          <w:sz w:val="20"/>
+          <w:szCs w:val="20"/>
+        </w:rPr>
+        <w:t xml:space="preserve">ANÁLISE DA EXPOSIÇÃO AOS POSSÍVEIS AGENTES INSALUBRES .... </w:t>
+      </w:r>
+    </w:p>
+    <w:p>
+      <w:pPr>
+        <w:pStyle w:val="Normal"/>
+        <w:numPr>
+          <w:ilvl w:val="0"/>
+          <w:numId w:val="1"/>
+        </w:numPr>
+        <w:spacing w:lineRule="auto" w:line="360"/>
+        <w:rPr>
+          <w:sz w:val="20"/>
+          <w:szCs w:val="20"/>
+        </w:rPr>
+      </w:pPr>
+      <w:r>
+        <w:rPr>
+          <w:rFonts w:cs="Arial" w:ascii="Arial" w:hAnsi="Arial"/>
+          <w:b/>
+          <w:bCs/>
+          <w:sz w:val="20"/>
+          <w:szCs w:val="20"/>
+        </w:rPr>
+        <w:t xml:space="preserve">CONCLUSÃO TÉCNICA ............................................................................ </w:t>
+      </w:r>
+    </w:p>
+    <w:p>
+      <w:pPr>
+        <w:pStyle w:val="Normal"/>
+        <w:numPr>
+          <w:ilvl w:val="0"/>
+          <w:numId w:val="1"/>
+        </w:numPr>
+        <w:spacing w:lineRule="auto" w:line="360"/>
+        <w:rPr>
+          <w:sz w:val="20"/>
+          <w:szCs w:val="20"/>
+        </w:rPr>
+      </w:pPr>
+      <w:r>
+        <w:rPr>
+          <w:rFonts w:cs="Arial" w:ascii="Arial" w:hAnsi="Arial"/>
+          <w:b/>
+          <w:bCs/>
+          <w:sz w:val="20"/>
+          <w:szCs w:val="20"/>
+        </w:rPr>
+        <w:t xml:space="preserve">HONORÁRIOS PERICIAIS ....................................................................... </w:t>
+      </w:r>
+    </w:p>
+    <w:p>
+      <w:pPr>
+        <w:pStyle w:val="Normal"/>
+        <w:numPr>
+          <w:ilvl w:val="0"/>
+          <w:numId w:val="1"/>
+        </w:numPr>
+        <w:spacing w:lineRule="auto" w:line="360"/>
+        <w:rPr>
+          <w:sz w:val="20"/>
+          <w:szCs w:val="20"/>
+        </w:rPr>
+      </w:pPr>
+      <w:r>
+        <w:rPr>
+          <w:rFonts w:cs="Arial" w:ascii="Arial" w:hAnsi="Arial"/>
+          <w:b/>
+          <w:bCs/>
+          <w:sz w:val="20"/>
+          <w:szCs w:val="20"/>
+        </w:rPr>
+        <w:t xml:space="preserve">RESPOSTAS AOS QUESITOS APRESENTADOS PELA RECLAMANTE................................................................................................ </w:t>
+      </w:r>
+    </w:p>
+    <w:p>
+      <w:pPr>
+        <w:pStyle w:val="Normal"/>
+        <w:numPr>
+          <w:ilvl w:val="0"/>
+          <w:numId w:val="1"/>
+        </w:numPr>
+        <w:spacing w:lineRule="auto" w:line="360"/>
+        <w:rPr>
+          <w:sz w:val="20"/>
+          <w:szCs w:val="20"/>
+        </w:rPr>
+      </w:pPr>
+      <w:r>
+        <w:rPr>
+          <w:rFonts w:cs="Arial" w:ascii="Arial" w:hAnsi="Arial"/>
+          <w:b/>
+          <w:bCs/>
+          <w:sz w:val="20"/>
+          <w:szCs w:val="20"/>
+        </w:rPr>
+        <w:t xml:space="preserve">RESPOSTAS AOS QUESITOS APRESENTADOS ELA RECLMADA..................................................................................................... </w:t>
+      </w:r>
+    </w:p>
+    <w:p>
+      <w:pPr>
+        <w:pStyle w:val="Normal"/>
+        <w:numPr>
+          <w:ilvl w:val="0"/>
+          <w:numId w:val="1"/>
+        </w:numPr>
+        <w:spacing w:lineRule="auto" w:line="360"/>
+        <w:rPr>
+          <w:sz w:val="20"/>
+          <w:szCs w:val="20"/>
+        </w:rPr>
+      </w:pPr>
+      <w:r>
+        <w:rPr>
+          <w:rFonts w:cs="Arial" w:ascii="Arial" w:hAnsi="Arial"/>
+          <w:b/>
+          <w:bCs/>
+          <w:sz w:val="20"/>
+          <w:szCs w:val="20"/>
+        </w:rPr>
+        <w:t xml:space="preserve">BIBLIOGRAFIA CONSULTADA ................................................................ </w:t>
+      </w:r>
+    </w:p>
+    <w:p>
+      <w:pPr>
+        <w:pStyle w:val="Normal"/>
+        <w:numPr>
+          <w:ilvl w:val="0"/>
+          <w:numId w:val="1"/>
+        </w:numPr>
+        <w:spacing w:lineRule="auto" w:line="360"/>
+        <w:rPr>
+          <w:sz w:val="20"/>
+          <w:szCs w:val="20"/>
+        </w:rPr>
+      </w:pPr>
+      <w:r>
+        <w:rPr>
+          <w:rFonts w:cs="Arial" w:ascii="Arial" w:hAnsi="Arial"/>
+          <w:b/>
+          <w:bCs/>
+          <w:sz w:val="20"/>
+          <w:szCs w:val="20"/>
+        </w:rPr>
+        <w:t>ENCENRRAMENTO..............................................................................…</w:t>
       </w:r>
     </w:p>
     <w:p>
@@ -508,18 +889,17 @@
         <w:pStyle w:val="Normal"/>
         <w:spacing w:lineRule="auto" w:line="360"/>
         <w:rPr>
-          <w:rFonts w:ascii="Arial" w:hAnsi="Arial" w:cs="Arial"/>
-          <w:b/>
-          <w:bCs/>
-        </w:rPr>
-      </w:pPr>
-      <w:r>
-        <w:rPr>
-          <w:rFonts w:cs="Arial" w:ascii="Arial" w:hAnsi="Arial"/>
-          <w:b/>
-          <w:bCs/>
-        </w:rPr>
-        <w:t>2. QUALIFICAÇÃO DO PERITO........................................................................</w:t>
+          <w:rFonts w:cs="Arial"/>
+          <w:b/>
+          <w:bCs/>
+        </w:rPr>
+      </w:pPr>
+      <w:r>
+        <w:rPr>
+          <w:rFonts w:cs="Arial"/>
+          <w:b/>
+          <w:bCs/>
+        </w:rPr>
       </w:r>
     </w:p>
     <w:p>
@@ -527,26 +907,17 @@
         <w:pStyle w:val="Normal"/>
         <w:spacing w:lineRule="auto" w:line="360"/>
         <w:rPr>
-          <w:rFonts w:ascii="Arial" w:hAnsi="Arial" w:cs="Arial"/>
-          <w:b/>
-          <w:bCs/>
-        </w:rPr>
-      </w:pPr>
-      <w:r>
-        <w:rPr>
-          <w:rFonts w:cs="Arial" w:ascii="Arial" w:hAnsi="Arial"/>
-          <w:b/>
-          <w:bCs/>
-        </w:rPr>
-        <w:t xml:space="preserve"> </w:t>
-      </w:r>
-      <w:r>
-        <w:rPr>
-          <w:rFonts w:cs="Arial" w:ascii="Arial" w:hAnsi="Arial"/>
-          <w:b/>
-          <w:bCs/>
-        </w:rPr>
-        <w:t xml:space="preserve">3. FUNDAMENTAÇÃO LEGAL E TÉCNICA..................................................... 4. OBJETO DA PERÍCIA ................................................................................... 5. METODOLOGIA UTILIZADA......................................................................... 6. PRESENTES À DILIGÊNCIA PERICIAL ....................................................... 7. AMBIENTE DE TRABALHO DA RECLAMANTE........................................... 8. DESCRIÇÃO DAS ATIVIDADES DA RECLAMANTE.................................... 9. ANÁLISE DA EXPOSIÇÃO AOS POSSÍVEIS AGENTES INSALUBRES .... 10. CONCLUSÃO TÉCNICA ............................................................................ </w:t>
+          <w:rFonts w:cs="Arial"/>
+          <w:b/>
+          <w:bCs/>
+        </w:rPr>
+      </w:pPr>
+      <w:r>
+        <w:rPr>
+          <w:rFonts w:cs="Arial"/>
+          <w:b/>
+          <w:bCs/>
+        </w:rPr>
       </w:r>
     </w:p>
     <w:p>
@@ -554,18 +925,17 @@
         <w:pStyle w:val="Normal"/>
         <w:spacing w:lineRule="auto" w:line="360"/>
         <w:rPr>
-          <w:rFonts w:ascii="Arial" w:hAnsi="Arial" w:cs="Arial"/>
-          <w:b/>
-          <w:bCs/>
-        </w:rPr>
-      </w:pPr>
-      <w:r>
-        <w:rPr>
-          <w:rFonts w:cs="Arial" w:ascii="Arial" w:hAnsi="Arial"/>
-          <w:b/>
-          <w:bCs/>
-        </w:rPr>
-        <w:t xml:space="preserve">11. HONORÁRIOS PERICIAIS ....................................................................... 12. RESPOSTAS AOS QUESITOS APRESENTADOS PELA RECLAMANTE................................................................................................ </w:t>
+          <w:rFonts w:cs="Arial"/>
+          <w:b/>
+          <w:bCs/>
+        </w:rPr>
+      </w:pPr>
+      <w:r>
+        <w:rPr>
+          <w:rFonts w:cs="Arial"/>
+          <w:b/>
+          <w:bCs/>
+        </w:rPr>
       </w:r>
     </w:p>
     <w:p>
@@ -573,18 +943,17 @@
         <w:pStyle w:val="Normal"/>
         <w:spacing w:lineRule="auto" w:line="360"/>
         <w:rPr>
-          <w:rFonts w:ascii="Arial" w:hAnsi="Arial" w:cs="Arial"/>
-          <w:b/>
-          <w:bCs/>
-        </w:rPr>
-      </w:pPr>
-      <w:r>
-        <w:rPr>
-          <w:rFonts w:cs="Arial" w:ascii="Arial" w:hAnsi="Arial"/>
-          <w:b/>
-          <w:bCs/>
-        </w:rPr>
-        <w:t xml:space="preserve">13. RESPOSTAS AOS QUESITOS APRESENTADOS ELA RECLMADA..................................................................................................... </w:t>
+          <w:rFonts w:cs="Arial"/>
+          <w:b/>
+          <w:bCs/>
+        </w:rPr>
+      </w:pPr>
+      <w:r>
+        <w:rPr>
+          <w:rFonts w:cs="Arial"/>
+          <w:b/>
+          <w:bCs/>
+        </w:rPr>
       </w:r>
     </w:p>
     <w:p>
@@ -599,11 +968,10 @@
       </w:pPr>
       <w:r>
         <w:rPr>
-          <w:rFonts w:cs="Arial" w:ascii="Arial" w:hAnsi="Arial"/>
-          <w:b/>
-          <w:bCs/>
-        </w:rPr>
-        <w:t>14. BIBLIOGRAFIA CONSULTADA ................................................................ 15. ENCENRRAMENTO..............................................................................…</w:t>
+          <w:rFonts w:cs="Arial"/>
+          <w:b/>
+          <w:bCs/>
+        </w:rPr>
       </w:r>
     </w:p>
     <w:p>
@@ -618,96 +986,6 @@
       </w:pPr>
       <w:r>
         <w:rPr>
-          <w:rFonts w:cs="Arial"/>
-          <w:b/>
-          <w:bCs/>
-        </w:rPr>
-      </w:r>
-    </w:p>
-    <w:p>
-      <w:pPr>
-        <w:pStyle w:val="Normal"/>
-        <w:spacing w:lineRule="auto" w:line="360"/>
-        <w:rPr>
-          <w:rFonts w:cs="Arial"/>
-          <w:b/>
-          <w:bCs/>
-        </w:rPr>
-      </w:pPr>
-      <w:r>
-        <w:rPr>
-          <w:rFonts w:cs="Arial"/>
-          <w:b/>
-          <w:bCs/>
-        </w:rPr>
-      </w:r>
-    </w:p>
-    <w:p>
-      <w:pPr>
-        <w:pStyle w:val="Normal"/>
-        <w:spacing w:lineRule="auto" w:line="360"/>
-        <w:rPr>
-          <w:rFonts w:cs="Arial"/>
-          <w:b/>
-          <w:bCs/>
-        </w:rPr>
-      </w:pPr>
-      <w:r>
-        <w:rPr>
-          <w:rFonts w:cs="Arial"/>
-          <w:b/>
-          <w:bCs/>
-        </w:rPr>
-      </w:r>
-    </w:p>
-    <w:p>
-      <w:pPr>
-        <w:pStyle w:val="Normal"/>
-        <w:spacing w:lineRule="auto" w:line="360"/>
-        <w:rPr>
-          <w:rFonts w:cs="Arial"/>
-          <w:b/>
-          <w:bCs/>
-        </w:rPr>
-      </w:pPr>
-      <w:r>
-        <w:rPr>
-          <w:rFonts w:cs="Arial"/>
-          <w:b/>
-          <w:bCs/>
-        </w:rPr>
-      </w:r>
-    </w:p>
-    <w:p>
-      <w:pPr>
-        <w:pStyle w:val="Normal"/>
-        <w:spacing w:lineRule="auto" w:line="360"/>
-        <w:rPr>
-          <w:rFonts w:cs="Arial"/>
-          <w:b/>
-          <w:bCs/>
-        </w:rPr>
-      </w:pPr>
-      <w:r>
-        <w:rPr>
-          <w:rFonts w:cs="Arial"/>
-          <w:b/>
-          <w:bCs/>
-        </w:rPr>
-      </w:r>
-    </w:p>
-    <w:p>
-      <w:pPr>
-        <w:pStyle w:val="Normal"/>
-        <w:spacing w:lineRule="auto" w:line="360"/>
-        <w:rPr>
-          <w:rFonts w:cs="Arial"/>
-          <w:b/>
-          <w:bCs/>
-        </w:rPr>
-      </w:pPr>
-      <w:r>
-        <w:rPr>
           <w:rFonts w:cs="Arial" w:ascii="Arial" w:hAnsi="Arial"/>
           <w:b/>
           <w:bCs/>
@@ -717,19 +995,10 @@
     </w:p>
     <w:p>
       <w:pPr>
-        <w:pStyle w:val="Normal"/>
-        <w:rPr/>
-      </w:pPr>
-      <w:r>
-        <w:rPr/>
-      </w:r>
-    </w:p>
-    <w:p>
-      <w:pPr>
         <w:pStyle w:val="ListParagraph"/>
         <w:numPr>
           <w:ilvl w:val="0"/>
-          <w:numId w:val="1"/>
+          <w:numId w:val="2"/>
         </w:numPr>
         <w:rPr>
           <w:rFonts w:ascii="Arial" w:hAnsi="Arial" w:cs="Arial"/>
@@ -752,16 +1021,12 @@
     </w:p>
     <w:p>
       <w:pPr>
-        <w:pStyle w:val="Normal"/>
-        <w:rPr/>
-      </w:pPr>
-      <w:r>
-        <w:rPr/>
-      </w:r>
-    </w:p>
-    <w:p>
-      <w:pPr>
         <w:pStyle w:val="ListParagraph"/>
+        <w:numPr>
+          <w:ilvl w:val="0"/>
+          <w:numId w:val="0"/>
+        </w:numPr>
+        <w:ind w:hanging="0" w:left="720"/>
         <w:rPr>
           <w:rFonts w:ascii="Arial" w:hAnsi="Arial" w:cs="Arial"/>
           <w:b/>
@@ -802,6 +1067,11 @@
     <w:p>
       <w:pPr>
         <w:pStyle w:val="ListParagraph"/>
+        <w:numPr>
+          <w:ilvl w:val="0"/>
+          <w:numId w:val="0"/>
+        </w:numPr>
+        <w:ind w:hanging="0" w:left="720"/>
         <w:rPr>
           <w:rFonts w:ascii="Arial" w:hAnsi="Arial" w:cs="Arial"/>
           <w:b/>
@@ -842,6 +1112,11 @@
     <w:p>
       <w:pPr>
         <w:pStyle w:val="ListParagraph"/>
+        <w:numPr>
+          <w:ilvl w:val="0"/>
+          <w:numId w:val="0"/>
+        </w:numPr>
+        <w:ind w:hanging="0" w:left="720"/>
         <w:rPr>
           <w:rFonts w:ascii="Arial" w:hAnsi="Arial" w:cs="Arial"/>
           <w:b/>
@@ -882,6 +1157,11 @@
     <w:p>
       <w:pPr>
         <w:pStyle w:val="ListParagraph"/>
+        <w:numPr>
+          <w:ilvl w:val="0"/>
+          <w:numId w:val="0"/>
+        </w:numPr>
+        <w:ind w:hanging="0" w:left="720"/>
         <w:rPr>
           <w:rFonts w:ascii="Arial" w:hAnsi="Arial" w:cs="Arial"/>
           <w:b/>
@@ -918,19 +1198,21 @@
           <w:rFonts w:ascii="Arial" w:hAnsi="Arial" w:cs="Arial"/>
           <w:b/>
           <w:bCs/>
-        </w:rPr>
-      </w:pPr>
-      <w:r>
-        <w:rPr>
-          <w:rFonts w:cs="Arial" w:ascii="Arial" w:hAnsi="Arial"/>
-          <w:b/>
-          <w:bCs/>
-        </w:rPr>
+          <w:sz w:val="22"/>
+          <w:szCs w:val="22"/>
+        </w:rPr>
+      </w:pPr>
+      <w:r>
+        <w:rPr/>
       </w:r>
     </w:p>
     <w:p>
       <w:pPr>
         <w:pStyle w:val="ListParagraph"/>
+        <w:numPr>
+          <w:ilvl w:val="0"/>
+          <w:numId w:val="2"/>
+        </w:numPr>
         <w:rPr>
           <w:rFonts w:ascii="Arial" w:hAnsi="Arial" w:cs="Arial"/>
           <w:b/>
@@ -947,6 +1229,52 @@
           <w:sz w:val="28"/>
           <w:szCs w:val="28"/>
         </w:rPr>
+        <w:t>QUALIFICAÇÃO DO PERITO:</w:t>
+      </w:r>
+    </w:p>
+    <w:p>
+      <w:pPr>
+        <w:pStyle w:val="Normal"/>
+        <w:numPr>
+          <w:ilvl w:val="0"/>
+          <w:numId w:val="0"/>
+        </w:numPr>
+        <w:ind w:hanging="0" w:left="720"/>
+        <w:jc w:val="both"/>
+        <w:rPr>
+          <w:rFonts w:ascii="Arial" w:hAnsi="Arial" w:cs="Arial"/>
+          <w:sz w:val="22"/>
+          <w:szCs w:val="22"/>
+        </w:rPr>
+      </w:pPr>
+      <w:r>
+        <w:rPr>
+          <w:rFonts w:cs="Arial" w:ascii="Arial" w:hAnsi="Arial"/>
+          <w:b w:val="false"/>
+          <w:bCs w:val="false"/>
+          <w:sz w:val="22"/>
+          <w:szCs w:val="22"/>
+        </w:rPr>
+        <w:t>Helder Chagas Febronio Alves. Engenheiro Químico, especialista em Engenharia de Segurança do Trabalho e em Higiene Ocupacional, auditor interno em Sistema de Gestão Integrada (SGI) inscrito no CREA – Conselho Regional de Engenharia e Agronomia, com registro nacional de nº 020753926-0.</w:t>
+      </w:r>
+    </w:p>
+    <w:p>
+      <w:pPr>
+        <w:pStyle w:val="Normal"/>
+        <w:numPr>
+          <w:ilvl w:val="0"/>
+          <w:numId w:val="0"/>
+        </w:numPr>
+        <w:ind w:hanging="0" w:left="720"/>
+        <w:jc w:val="both"/>
+        <w:rPr>
+          <w:rFonts w:ascii="Arial" w:hAnsi="Arial" w:cs="Arial"/>
+          <w:sz w:val="22"/>
+          <w:szCs w:val="22"/>
+        </w:rPr>
+      </w:pPr>
+      <w:r>
+        <w:rPr/>
       </w:r>
     </w:p>
     <w:p>
@@ -954,7 +1282,7 @@
         <w:pStyle w:val="ListParagraph"/>
         <w:numPr>
           <w:ilvl w:val="0"/>
-          <w:numId w:val="1"/>
+          <w:numId w:val="2"/>
         </w:numPr>
         <w:rPr>
           <w:rFonts w:ascii="Arial" w:hAnsi="Arial" w:cs="Arial"/>
@@ -972,90 +1300,198 @@
           <w:sz w:val="28"/>
           <w:szCs w:val="28"/>
         </w:rPr>
-        <w:t>QUALIFICAÇÃO DO PERITO:</w:t>
-      </w:r>
-    </w:p>
-    <w:p>
-      <w:pPr>
-        <w:pStyle w:val="Normal"/>
-        <w:jc w:val="both"/>
-        <w:rPr>
-          <w:rFonts w:ascii="Arial" w:hAnsi="Arial" w:cs="Arial"/>
-          <w:sz w:val="22"/>
-          <w:szCs w:val="22"/>
-        </w:rPr>
-      </w:pPr>
-      <w:r>
-        <w:rPr>
-          <w:rFonts w:cs="Arial" w:ascii="Arial" w:hAnsi="Arial"/>
-          <w:sz w:val="22"/>
-          <w:szCs w:val="22"/>
-        </w:rPr>
-        <w:t>Helder Chagas Febronio Alves. Engenheiro Químico, especialista em Engenharia de Segurança do Trabalho e em Higiene Ocupacional, auditor interno em Sistema de Gestão Integrada (SGI) inscrito no CREA – Conselho Regional de Engenharia e Agronomia, com registro nacional de nº 020753926-0.</w:t>
-      </w:r>
-    </w:p>
-    <w:p>
-      <w:pPr>
-        <w:pStyle w:val="Normal"/>
-        <w:rPr>
-          <w:rFonts w:ascii="Arial" w:hAnsi="Arial" w:cs="Arial"/>
+        <w:t>METODOLOGIA:</w:t>
+      </w:r>
+    </w:p>
+    <w:p>
+      <w:pPr>
+        <w:pStyle w:val="meusumrio"/>
+        <w:numPr>
+          <w:ilvl w:val="0"/>
+          <w:numId w:val="0"/>
+        </w:numPr>
+        <w:ind w:hanging="0" w:left="708"/>
+        <w:rPr>
+          <w:b w:val="false"/>
+          <w:bCs/>
+          <w:sz w:val="22"/>
+          <w:szCs w:val="22"/>
+        </w:rPr>
+      </w:pPr>
+      <w:r>
+        <w:rPr>
+          <w:b w:val="false"/>
+          <w:bCs/>
+          <w:sz w:val="22"/>
+          <w:szCs w:val="22"/>
+        </w:rPr>
+        <w:t xml:space="preserve">A elaboração deste laudo foi subsidiada por avaliação qualitativa das atividades laborais e fatores de riscos associados às tarefas desenvolvidas pelo(a) reclamante, em conformidade com o prescrito pelas Normas de Higiene Ocupacionais - NHO; Norma Regulamentadora nº. </w:t>
+      </w:r>
+      <w:r>
+        <w:rPr>
+          <w:b w:val="false"/>
+          <w:bCs w:val="false"/>
+          <w:sz w:val="22"/>
+          <w:szCs w:val="22"/>
+        </w:rPr>
+        <w:t>{{TipoNorma}}</w:t>
+      </w:r>
+      <w:r>
+        <w:rPr>
+          <w:b w:val="false"/>
+          <w:bCs/>
+          <w:sz w:val="22"/>
+          <w:szCs w:val="22"/>
+        </w:rPr>
+        <w:t>. Publicada pela Portaria 3.214/78 do Ministério do Trabalho, considerando:</w:t>
+      </w:r>
+    </w:p>
+    <w:p>
+      <w:pPr>
+        <w:pStyle w:val="meusumrio"/>
+        <w:numPr>
+          <w:ilvl w:val="0"/>
+          <w:numId w:val="0"/>
+        </w:numPr>
+        <w:ind w:hanging="0" w:left="708"/>
+        <w:rPr>
+          <w:b w:val="false"/>
+          <w:bCs/>
+          <w:sz w:val="22"/>
+          <w:szCs w:val="22"/>
+        </w:rPr>
+      </w:pPr>
+      <w:r>
+        <w:rPr>
+          <w:b w:val="false"/>
+          <w:bCs/>
+          <w:sz w:val="22"/>
+          <w:szCs w:val="22"/>
+        </w:rPr>
+      </w:r>
+    </w:p>
+    <w:p>
+      <w:pPr>
+        <w:pStyle w:val="meusumrio"/>
+        <w:numPr>
+          <w:ilvl w:val="0"/>
+          <w:numId w:val="0"/>
+        </w:numPr>
+        <w:ind w:hanging="0" w:left="708"/>
+        <w:rPr>
+          <w:b w:val="false"/>
+          <w:bCs w:val="false"/>
+        </w:rPr>
+      </w:pPr>
+      <w:r>
+        <w:rPr>
+          <w:rFonts w:cs="Arial"/>
+          <w:b w:val="false"/>
+          <w:bCs w:val="false"/>
+          <w:sz w:val="22"/>
+          <w:szCs w:val="22"/>
+        </w:rPr>
+        <w:t>{{Anexos}</w:t>
+      </w:r>
+      <w:r>
+        <w:rPr>
+          <w:rFonts w:cs="Arial"/>
+          <w:b w:val="false"/>
+          <w:bCs w:val="false"/>
+          <w:sz w:val="22"/>
+          <w:szCs w:val="22"/>
+        </w:rPr>
+        <w:t>}</w:t>
+      </w:r>
+    </w:p>
+    <w:p>
+      <w:pPr>
+        <w:pStyle w:val="meusumrio"/>
+        <w:numPr>
+          <w:ilvl w:val="0"/>
+          <w:numId w:val="2"/>
+        </w:numPr>
+        <w:ind w:left="708"/>
+        <w:rPr>
           <w:sz w:val="28"/>
           <w:szCs w:val="28"/>
         </w:rPr>
       </w:pPr>
       <w:r>
         <w:rPr>
-          <w:rFonts w:cs="Arial" w:ascii="Arial" w:hAnsi="Arial"/>
+          <w:rFonts w:cs="Arial"/>
+          <w:b w:val="false"/>
+          <w:bCs w:val="false"/>
           <w:sz w:val="28"/>
           <w:szCs w:val="28"/>
         </w:rPr>
-      </w:r>
-    </w:p>
-    <w:p>
-      <w:pPr>
-        <w:pStyle w:val="ListParagraph"/>
-        <w:numPr>
-          <w:ilvl w:val="0"/>
-          <w:numId w:val="1"/>
-        </w:numPr>
-        <w:rPr>
-          <w:rFonts w:ascii="Arial" w:hAnsi="Arial" w:cs="Arial"/>
-          <w:b/>
-          <w:bCs/>
+        <w:t>Síntese da Inicial:</w:t>
+      </w:r>
+    </w:p>
+    <w:p>
+      <w:pPr>
+        <w:pStyle w:val="meusumrio"/>
+        <w:numPr>
+          <w:ilvl w:val="0"/>
+          <w:numId w:val="2"/>
+        </w:numPr>
+        <w:ind w:left="708"/>
+        <w:rPr>
           <w:sz w:val="28"/>
           <w:szCs w:val="28"/>
         </w:rPr>
       </w:pPr>
       <w:r>
         <w:rPr>
-          <w:rFonts w:cs="Arial" w:ascii="Arial" w:hAnsi="Arial"/>
-          <w:b/>
-          <w:bCs/>
+          <w:rFonts w:cs="Arial"/>
+          <w:b w:val="false"/>
+          <w:bCs w:val="false"/>
           <w:sz w:val="28"/>
           <w:szCs w:val="28"/>
         </w:rPr>
-        <w:t>METODOLOGIA:</w:t>
+        <w:t>Síntese da Contestação:</w:t>
       </w:r>
     </w:p>
     <w:p>
       <w:pPr>
         <w:pStyle w:val="meusumrio"/>
+        <w:numPr>
+          <w:ilvl w:val="0"/>
+          <w:numId w:val="2"/>
+        </w:numPr>
         <w:ind w:left="708"/>
         <w:rPr>
-          <w:b w:val="false"/>
-          <w:bCs/>
-          <w:sz w:val="22"/>
-          <w:szCs w:val="22"/>
-        </w:rPr>
-      </w:pPr>
-      <w:r>
-        <w:rPr>
-          <w:b w:val="false"/>
-          <w:bCs/>
-          <w:sz w:val="22"/>
-          <w:szCs w:val="22"/>
-        </w:rPr>
-        <w:t xml:space="preserve">A elaboração deste laudo foi subsidiada por avaliação qualitativa das atividades laborais e fatores de riscos associados às tarefas desenvolvidas pelo(a) reclamante, em conformidade com o prescrito pelas Normas de Higiene Ocupacionais - NHO; Norma Regulamentadora nº. </w:t>
+          <w:sz w:val="28"/>
+          <w:szCs w:val="28"/>
+        </w:rPr>
+      </w:pPr>
+      <w:r>
+        <w:rPr>
+          <w:sz w:val="28"/>
+          <w:szCs w:val="28"/>
+        </w:rPr>
+        <w:t>DILIGÊNCIA PERICIAL:</w:t>
+      </w:r>
+    </w:p>
+    <w:p>
+      <w:pPr>
+        <w:pStyle w:val="meusumrio"/>
+        <w:numPr>
+          <w:ilvl w:val="0"/>
+          <w:numId w:val="0"/>
+        </w:numPr>
+        <w:ind w:hanging="0" w:left="708"/>
+        <w:rPr>
+          <w:sz w:val="22"/>
+          <w:szCs w:val="22"/>
+        </w:rPr>
+      </w:pPr>
+      <w:r>
+        <w:rPr>
+          <w:sz w:val="22"/>
+          <w:szCs w:val="22"/>
+        </w:rPr>
+        <w:t>Data:</w:t>
       </w:r>
       <w:r>
         <w:rPr>
@@ -1064,134 +1500,72 @@
           <w:sz w:val="22"/>
           <w:szCs w:val="22"/>
         </w:rPr>
-        <w:t>{{TipoNorma}}</w:t>
-      </w:r>
-      <w:r>
-        <w:rPr>
-          <w:b w:val="false"/>
-          <w:bCs/>
-          <w:sz w:val="22"/>
-          <w:szCs w:val="22"/>
-        </w:rPr>
-        <w:t>. Publicada pela Portaria 3.214/78 do Ministério do Trabalho, considerando:</w:t>
+        <w:t>{{DataPericia}}</w:t>
       </w:r>
     </w:p>
     <w:p>
       <w:pPr>
         <w:pStyle w:val="meusumrio"/>
-        <w:ind w:left="708"/>
-        <w:rPr>
-          <w:b w:val="false"/>
-          <w:bCs/>
-          <w:sz w:val="22"/>
-          <w:szCs w:val="22"/>
-        </w:rPr>
-      </w:pPr>
-      <w:r>
-        <w:rPr>
-          <w:b w:val="false"/>
-          <w:bCs/>
-          <w:sz w:val="22"/>
-          <w:szCs w:val="22"/>
-        </w:rPr>
+        <w:numPr>
+          <w:ilvl w:val="0"/>
+          <w:numId w:val="0"/>
+        </w:numPr>
+        <w:ind w:hanging="0" w:left="708"/>
+        <w:rPr>
+          <w:sz w:val="22"/>
+          <w:szCs w:val="22"/>
+        </w:rPr>
+      </w:pPr>
+      <w:r>
+        <w:rPr>
+          <w:sz w:val="22"/>
+          <w:szCs w:val="22"/>
+        </w:rPr>
+        <w:t>Horário:</w:t>
+      </w:r>
+      <w:r>
+        <w:rPr>
+          <w:rFonts w:eastAsia="Aptos" w:cs="" w:ascii="Aptos" w:hAnsi="Aptos" w:asciiTheme="minorHAnsi" w:cstheme="minorBidi" w:eastAsiaTheme="minorHAnsi" w:hAnsiTheme="minorHAnsi"/>
+          <w:sz w:val="22"/>
+          <w:szCs w:val="22"/>
+          <w:shd w:fill="FFFF00" w:val="clear"/>
+          <w14:ligatures w14:val="standardContextual"/>
+        </w:rPr>
+        <w:t>{{HoraPericia}}</w:t>
       </w:r>
     </w:p>
     <w:p>
       <w:pPr>
         <w:pStyle w:val="meusumrio"/>
-        <w:ind w:left="708"/>
-        <w:rPr>
+        <w:numPr>
+          <w:ilvl w:val="0"/>
+          <w:numId w:val="0"/>
+        </w:numPr>
+        <w:ind w:hanging="0" w:left="708"/>
+        <w:rPr>
+          <w:sz w:val="22"/>
+          <w:szCs w:val="22"/>
+        </w:rPr>
+      </w:pPr>
+      <w:r>
+        <w:rPr>
+          <w:rFonts w:cs="Arial"/>
           <w:b w:val="false"/>
           <w:bCs w:val="false"/>
-        </w:rPr>
-      </w:pPr>
-      <w:r>
-        <w:rPr>
-          <w:b w:val="false"/>
-          <w:bCs w:val="false"/>
-          <w:sz w:val="22"/>
-          <w:szCs w:val="22"/>
-        </w:rPr>
-        <w:t>{{Anexos}}</w:t>
+          <w:sz w:val="22"/>
+          <w:szCs w:val="22"/>
+        </w:rPr>
+        <w:t>Local:{{LocalDeTrabalho}}</w:t>
       </w:r>
     </w:p>
     <w:p>
       <w:pPr>
         <w:pStyle w:val="meusumrio"/>
+        <w:numPr>
+          <w:ilvl w:val="0"/>
+          <w:numId w:val="2"/>
+        </w:numPr>
         <w:ind w:left="708"/>
-        <w:rPr/>
-      </w:pPr>
-      <w:r>
-        <w:rPr/>
-      </w:r>
-    </w:p>
-    <w:p>
-      <w:pPr>
-        <w:pStyle w:val="meusumrio"/>
-        <w:ind w:left="708"/>
-        <w:rPr/>
-      </w:pPr>
-      <w:r>
-        <w:rPr/>
-      </w:r>
-    </w:p>
-    <w:p>
-      <w:pPr>
-        <w:pStyle w:val="meusumrio"/>
-        <w:ind w:left="708"/>
-        <w:rPr/>
-      </w:pPr>
-      <w:r>
-        <w:rPr/>
-      </w:r>
-    </w:p>
-    <w:p>
-      <w:pPr>
-        <w:pStyle w:val="meusumrio"/>
-        <w:ind w:left="708"/>
-        <w:rPr/>
-      </w:pPr>
-      <w:r>
-        <w:rPr/>
-      </w:r>
-    </w:p>
-    <w:p>
-      <w:pPr>
-        <w:pStyle w:val="meusumrio"/>
-        <w:ind w:left="708"/>
-        <w:rPr/>
-      </w:pPr>
-      <w:r>
-        <w:rPr/>
-      </w:r>
-    </w:p>
-    <w:p>
-      <w:pPr>
-        <w:pStyle w:val="meusumrio"/>
-        <w:ind w:left="708"/>
-        <w:rPr/>
-      </w:pPr>
-      <w:r>
-        <w:rPr/>
-      </w:r>
-    </w:p>
-    <w:p>
-      <w:pPr>
-        <w:pStyle w:val="meusumrio"/>
-        <w:ind w:left="708"/>
-        <w:rPr/>
-      </w:pPr>
-      <w:r>
-        <w:rPr/>
-      </w:r>
-    </w:p>
-    <w:p>
-      <w:pPr>
-        <w:pStyle w:val="meusumrio"/>
-        <w:numPr>
-          <w:ilvl w:val="0"/>
-          <w:numId w:val="1"/>
-        </w:numPr>
         <w:rPr>
           <w:sz w:val="28"/>
           <w:szCs w:val="28"/>
@@ -1202,96 +1576,17 @@
           <w:sz w:val="28"/>
           <w:szCs w:val="28"/>
         </w:rPr>
-        <w:t>Síntese da Inicial:</w:t>
+        <w:t>PRESENTES À DILIGÊNCIA PERICIAL:</w:t>
       </w:r>
     </w:p>
     <w:p>
       <w:pPr>
         <w:pStyle w:val="meusumrio"/>
-        <w:ind w:left="360"/>
-        <w:rPr/>
-      </w:pPr>
-      <w:r>
-        <w:rPr/>
-      </w:r>
-    </w:p>
-    <w:p>
-      <w:pPr>
-        <w:pStyle w:val="meusumrio"/>
-        <w:ind w:left="360"/>
-        <w:rPr/>
-      </w:pPr>
-      <w:r>
-        <w:rPr/>
-      </w:r>
-    </w:p>
-    <w:p>
-      <w:pPr>
-        <w:pStyle w:val="meusumrio"/>
-        <w:ind w:left="360"/>
-        <w:rPr/>
-      </w:pPr>
-      <w:r>
-        <w:rPr/>
-      </w:r>
-    </w:p>
-    <w:p>
-      <w:pPr>
-        <w:pStyle w:val="meusumrio"/>
-        <w:ind w:left="360"/>
-        <w:rPr/>
-      </w:pPr>
-      <w:r>
-        <w:rPr/>
-      </w:r>
-    </w:p>
-    <w:p>
-      <w:pPr>
-        <w:pStyle w:val="meusumrio"/>
-        <w:ind w:left="360"/>
-        <w:rPr/>
-      </w:pPr>
-      <w:r>
-        <w:rPr/>
-      </w:r>
-    </w:p>
-    <w:p>
-      <w:pPr>
-        <w:pStyle w:val="meusumrio"/>
-        <w:ind w:left="360"/>
-        <w:rPr/>
-      </w:pPr>
-      <w:r>
-        <w:rPr/>
-      </w:r>
-    </w:p>
-    <w:p>
-      <w:pPr>
-        <w:pStyle w:val="meusumrio"/>
-        <w:ind w:left="360"/>
-        <w:rPr/>
-      </w:pPr>
-      <w:r>
-        <w:rPr/>
-      </w:r>
-    </w:p>
-    <w:p>
-      <w:pPr>
-        <w:pStyle w:val="meusumrio"/>
-        <w:ind w:left="360"/>
-        <w:rPr/>
-      </w:pPr>
-      <w:r>
-        <w:rPr/>
-      </w:r>
-    </w:p>
-    <w:p>
-      <w:pPr>
-        <w:pStyle w:val="meusumrio"/>
-        <w:numPr>
-          <w:ilvl w:val="0"/>
-          <w:numId w:val="1"/>
-        </w:numPr>
+        <w:numPr>
+          <w:ilvl w:val="0"/>
+          <w:numId w:val="0"/>
+        </w:numPr>
+        <w:ind w:hanging="0" w:left="708"/>
         <w:rPr>
           <w:sz w:val="28"/>
           <w:szCs w:val="28"/>
@@ -1299,292 +1594,368 @@
       </w:pPr>
       <w:r>
         <w:rPr>
-          <w:sz w:val="28"/>
-          <w:szCs w:val="28"/>
-        </w:rPr>
-        <w:t>Síntese da Contestação:</w:t>
-      </w:r>
-    </w:p>
-    <w:p>
-      <w:pPr>
-        <w:pStyle w:val="meusumrio"/>
-        <w:ind w:left="360"/>
-        <w:rPr>
-          <w:sz w:val="28"/>
-          <w:szCs w:val="28"/>
-        </w:rPr>
-      </w:pPr>
-      <w:r>
-        <w:rPr>
-          <w:sz w:val="28"/>
-          <w:szCs w:val="28"/>
-        </w:rPr>
-      </w:r>
-    </w:p>
-    <w:p>
-      <w:pPr>
-        <w:pStyle w:val="meusumrio"/>
-        <w:ind w:left="360"/>
-        <w:rPr>
-          <w:sz w:val="28"/>
-          <w:szCs w:val="28"/>
-        </w:rPr>
-      </w:pPr>
-      <w:r>
-        <w:rPr>
-          <w:sz w:val="28"/>
-          <w:szCs w:val="28"/>
-        </w:rPr>
-      </w:r>
-    </w:p>
-    <w:p>
-      <w:pPr>
-        <w:pStyle w:val="meusumrio"/>
-        <w:ind w:left="360"/>
-        <w:rPr>
-          <w:sz w:val="28"/>
-          <w:szCs w:val="28"/>
-        </w:rPr>
-      </w:pPr>
-      <w:r>
-        <w:rPr>
-          <w:sz w:val="28"/>
-          <w:szCs w:val="28"/>
-        </w:rPr>
-      </w:r>
-    </w:p>
-    <w:p>
-      <w:pPr>
-        <w:pStyle w:val="meusumrio"/>
-        <w:ind w:left="360"/>
-        <w:rPr>
-          <w:sz w:val="28"/>
-          <w:szCs w:val="28"/>
-        </w:rPr>
-      </w:pPr>
-      <w:r>
-        <w:rPr>
-          <w:sz w:val="28"/>
-          <w:szCs w:val="28"/>
-        </w:rPr>
-      </w:r>
-    </w:p>
-    <w:p>
-      <w:pPr>
-        <w:pStyle w:val="meusumrio"/>
-        <w:ind w:left="360"/>
-        <w:rPr>
-          <w:sz w:val="28"/>
-          <w:szCs w:val="28"/>
-        </w:rPr>
-      </w:pPr>
-      <w:r>
-        <w:rPr>
-          <w:sz w:val="28"/>
-          <w:szCs w:val="28"/>
-        </w:rPr>
-      </w:r>
-    </w:p>
-    <w:p>
-      <w:pPr>
-        <w:pStyle w:val="meusumrio"/>
-        <w:numPr>
-          <w:ilvl w:val="0"/>
-          <w:numId w:val="1"/>
-        </w:numPr>
-        <w:rPr>
-          <w:sz w:val="28"/>
-          <w:szCs w:val="28"/>
-        </w:rPr>
-      </w:pPr>
-      <w:r>
-        <w:rPr>
-          <w:sz w:val="28"/>
-          <w:szCs w:val="28"/>
-        </w:rPr>
-        <w:t>DILIGÊNCIA PERICIAL:</w:t>
-      </w:r>
-    </w:p>
-    <w:p>
-      <w:pPr>
-        <w:pStyle w:val="meusumrio"/>
-        <w:ind w:left="360"/>
-        <w:rPr>
-          <w:sz w:val="28"/>
-          <w:szCs w:val="28"/>
-        </w:rPr>
-      </w:pPr>
-      <w:r>
-        <w:rPr>
-          <w:sz w:val="28"/>
-          <w:szCs w:val="28"/>
-        </w:rPr>
-      </w:r>
-    </w:p>
-    <w:p>
-      <w:pPr>
-        <w:pStyle w:val="meusumrio"/>
-        <w:ind w:left="360"/>
-        <w:rPr>
-          <w:sz w:val="22"/>
-          <w:szCs w:val="22"/>
-        </w:rPr>
-      </w:pPr>
-      <w:r>
-        <w:rPr>
-          <w:sz w:val="22"/>
-          <w:szCs w:val="22"/>
-        </w:rPr>
-        <w:t>Data:</w:t>
-      </w:r>
-      <w:r>
-        <w:rPr>
-          <w:b w:val="false"/>
-          <w:bCs w:val="false"/>
-          <w:sz w:val="22"/>
-          <w:szCs w:val="22"/>
-        </w:rPr>
-        <w:t>{{DataPericia}}</w:t>
-      </w:r>
-    </w:p>
-    <w:p>
-      <w:pPr>
-        <w:pStyle w:val="meusumrio"/>
-        <w:ind w:left="360"/>
-        <w:rPr>
-          <w:sz w:val="22"/>
-          <w:szCs w:val="22"/>
-        </w:rPr>
-      </w:pPr>
-      <w:r>
-        <w:rPr>
-          <w:sz w:val="22"/>
-          <w:szCs w:val="22"/>
-        </w:rPr>
-        <w:t>Horário:</w:t>
-      </w:r>
-      <w:r>
-        <w:rPr>
-          <w:rFonts w:eastAsia="Aptos" w:cs="" w:ascii="Aptos" w:hAnsi="Aptos" w:asciiTheme="minorHAnsi" w:cstheme="minorBidi" w:eastAsiaTheme="minorHAnsi" w:hAnsiTheme="minorHAnsi"/>
-          <w:sz w:val="22"/>
-          <w:szCs w:val="22"/>
-          <w:shd w:fill="FFFF00" w:val="clear"/>
-          <w14:ligatures w14:val="standardContextual"/>
-        </w:rPr>
-        <w:t>{{HoraPericia}}</w:t>
-      </w:r>
-    </w:p>
-    <w:p>
-      <w:pPr>
-        <w:pStyle w:val="meusumrio"/>
-        <w:ind w:left="360"/>
-        <w:rPr>
-          <w:sz w:val="22"/>
-          <w:szCs w:val="22"/>
-        </w:rPr>
-      </w:pPr>
-      <w:r>
-        <w:rPr>
-          <w:sz w:val="22"/>
-          <w:szCs w:val="22"/>
-        </w:rPr>
-        <w:t>Local:</w:t>
-      </w:r>
-      <w:r>
-        <w:rPr>
-          <w:b w:val="false"/>
-          <w:bCs w:val="false"/>
-          <w:sz w:val="22"/>
-          <w:szCs w:val="22"/>
-        </w:rPr>
-        <w:t>{{LocalDeTrabalho}}</w:t>
-      </w:r>
-    </w:p>
-    <w:p>
-      <w:pPr>
-        <w:pStyle w:val="meusumrio"/>
-        <w:ind w:left="360"/>
-        <w:rPr>
-          <w:sz w:val="22"/>
-          <w:szCs w:val="22"/>
-        </w:rPr>
-      </w:pPr>
-      <w:r>
-        <w:rPr>
-          <w:sz w:val="22"/>
-          <w:szCs w:val="22"/>
-        </w:rPr>
-      </w:r>
-    </w:p>
-    <w:p>
-      <w:pPr>
-        <w:pStyle w:val="meusumrio"/>
-        <w:numPr>
-          <w:ilvl w:val="0"/>
-          <w:numId w:val="1"/>
-        </w:numPr>
-        <w:rPr>
-          <w:sz w:val="28"/>
-          <w:szCs w:val="28"/>
-        </w:rPr>
-      </w:pPr>
-      <w:r>
-        <w:rPr>
-          <w:sz w:val="28"/>
-          <w:szCs w:val="28"/>
-        </w:rPr>
-        <w:t>PRESENTES À DILIGÊNCIA PERICIAL:</w:t>
-      </w:r>
-    </w:p>
-    <w:p>
-      <w:pPr>
-        <w:pStyle w:val="meusumrio"/>
-        <w:numPr>
-          <w:ilvl w:val="0"/>
-          <w:numId w:val="0"/>
-        </w:numPr>
-        <w:ind w:hanging="0" w:left="360"/>
-        <w:rPr>
-          <w:sz w:val="28"/>
-          <w:szCs w:val="28"/>
-        </w:rPr>
-      </w:pPr>
-      <w:r>
-        <w:rPr>
+          <w:rFonts w:cs="Arial"/>
           <w:b w:val="false"/>
           <w:bCs w:val="false"/>
           <w:sz w:val="24"/>
           <w:szCs w:val="24"/>
         </w:rPr>
-        <w:t>{{</w:t>
-      </w:r>
-      <w:r>
-        <w:rPr>
+        <w:t>{{presentes}}</w:t>
+      </w:r>
+    </w:p>
+    <w:p>
+      <w:pPr>
+        <w:pStyle w:val="ListParagraph"/>
+        <w:numPr>
+          <w:ilvl w:val="0"/>
+          <w:numId w:val="2"/>
+        </w:numPr>
+        <w:spacing w:lineRule="auto" w:line="259"/>
+        <w:jc w:val="both"/>
+        <w:rPr>
+          <w:rFonts w:ascii="Arial" w:hAnsi="Arial" w:cs="Arial"/>
+          <w:b/>
+          <w:bCs/>
+          <w:sz w:val="28"/>
+          <w:szCs w:val="28"/>
+        </w:rPr>
+      </w:pPr>
+      <w:r>
+        <w:rPr>
+          <w:rFonts w:cs="Arial" w:ascii="Arial" w:hAnsi="Arial"/>
+          <w:b/>
+          <w:bCs/>
+          <w:sz w:val="28"/>
+          <w:szCs w:val="28"/>
+        </w:rPr>
+        <w:t>Local de Trabalho</w:t>
+      </w:r>
+    </w:p>
+    <w:p>
+      <w:pPr>
+        <w:pStyle w:val="ListParagraph"/>
+        <w:numPr>
+          <w:ilvl w:val="0"/>
+          <w:numId w:val="0"/>
+        </w:numPr>
+        <w:ind w:hanging="0" w:left="360"/>
+        <w:jc w:val="both"/>
+        <w:rPr>
+          <w:rFonts w:ascii="Arial" w:hAnsi="Arial" w:cs="Arial"/>
+          <w:bCs/>
+        </w:rPr>
+      </w:pPr>
+      <w:r>
+        <w:rPr>
+          <w:rFonts w:cs="Arial" w:ascii="Arial" w:hAnsi="Arial"/>
+          <w:bCs/>
+        </w:rPr>
+      </w:r>
+    </w:p>
+    <w:p>
+      <w:pPr>
+        <w:pStyle w:val="ListParagraph"/>
+        <w:numPr>
+          <w:ilvl w:val="0"/>
+          <w:numId w:val="0"/>
+        </w:numPr>
+        <w:ind w:hanging="0" w:left="360"/>
+        <w:jc w:val="both"/>
+        <w:rPr>
+          <w:rFonts w:ascii="Arial" w:hAnsi="Arial" w:cs="Arial"/>
+          <w:b/>
+          <w:sz w:val="22"/>
+          <w:szCs w:val="22"/>
+        </w:rPr>
+      </w:pPr>
+      <w:r>
+        <w:rPr>
+          <w:rFonts w:cs="Arial" w:ascii="Arial" w:hAnsi="Arial"/>
+          <w:bCs/>
+          <w:sz w:val="22"/>
+          <w:szCs w:val="22"/>
+        </w:rPr>
+        <w:t xml:space="preserve">O autor desenvolveu as suas atividades no(a) </w:t>
+      </w:r>
+      <w:r>
+        <w:rPr>
+          <w:rFonts w:cs="Arial" w:ascii="Arial" w:hAnsi="Arial"/>
           <w:b w:val="false"/>
           <w:bCs w:val="false"/>
-          <w:sz w:val="24"/>
-          <w:szCs w:val="24"/>
-        </w:rPr>
-        <w:t>presentes</w:t>
-      </w:r>
-      <w:r>
-        <w:rPr>
+          <w:sz w:val="22"/>
+          <w:szCs w:val="22"/>
+        </w:rPr>
+        <w:t>{{LocalDeTrabalho}}</w:t>
+      </w:r>
+      <w:r>
+        <w:rPr>
+          <w:rFonts w:cs="Arial" w:ascii="Arial" w:hAnsi="Arial"/>
+          <w:bCs/>
+          <w:sz w:val="22"/>
+          <w:szCs w:val="22"/>
+        </w:rPr>
+        <w:t xml:space="preserve"> do(a) reclamado(a), o ambiente se encontra edificado em concreto armado, fechamento em alvenaria, paredes revestidas </w:t>
+      </w:r>
+      <w:r>
+        <w:rPr>
+          <w:rFonts w:cs="Arial" w:ascii="Arial" w:hAnsi="Arial"/>
           <w:b w:val="false"/>
           <w:bCs w:val="false"/>
-          <w:sz w:val="24"/>
-          <w:szCs w:val="24"/>
-        </w:rPr>
-        <w:t>}}</w:t>
+          <w:sz w:val="22"/>
+          <w:szCs w:val="22"/>
+        </w:rPr>
+        <w:t>{{Paredes}},</w:t>
+      </w:r>
+      <w:r>
+        <w:rPr>
+          <w:rFonts w:cs="Arial" w:ascii="Arial" w:hAnsi="Arial"/>
+          <w:bCs/>
+          <w:sz w:val="22"/>
+          <w:szCs w:val="22"/>
+        </w:rPr>
+        <w:t xml:space="preserve"> piso em material </w:t>
+      </w:r>
+      <w:r>
+        <w:rPr>
+          <w:rFonts w:cs="Arial" w:ascii="Arial" w:hAnsi="Arial"/>
+          <w:b w:val="false"/>
+          <w:bCs w:val="false"/>
+          <w:sz w:val="22"/>
+          <w:szCs w:val="22"/>
+        </w:rPr>
+        <w:t>{{Pisos}}</w:t>
+      </w:r>
+      <w:r>
+        <w:rPr>
+          <w:rFonts w:cs="Arial" w:ascii="Arial" w:hAnsi="Arial"/>
+          <w:bCs/>
+          <w:sz w:val="22"/>
+          <w:szCs w:val="22"/>
+        </w:rPr>
+        <w:t xml:space="preserve">, iluminação </w:t>
+      </w:r>
+      <w:r>
+        <w:rPr>
+          <w:rFonts w:cs="Arial" w:ascii="Arial" w:hAnsi="Arial"/>
+          <w:b w:val="false"/>
+          <w:bCs w:val="false"/>
+          <w:sz w:val="22"/>
+          <w:szCs w:val="22"/>
+        </w:rPr>
+        <w:t>{{Iluminacao}}</w:t>
+      </w:r>
+      <w:r>
+        <w:rPr>
+          <w:rFonts w:cs="Arial" w:ascii="Arial" w:hAnsi="Arial"/>
+          <w:bCs/>
+          <w:sz w:val="22"/>
+          <w:szCs w:val="22"/>
+        </w:rPr>
+        <w:t xml:space="preserve"> , Ventilação </w:t>
+      </w:r>
+      <w:r>
+        <w:rPr>
+          <w:rFonts w:cs="Arial" w:ascii="Arial" w:hAnsi="Arial"/>
+          <w:b w:val="false"/>
+          <w:bCs w:val="false"/>
+          <w:sz w:val="22"/>
+          <w:szCs w:val="22"/>
+        </w:rPr>
+        <w:t>{{Ventilacao}}Descrição das Atividades da Reclamante</w:t>
       </w:r>
     </w:p>
     <w:p>
       <w:pPr>
         <w:pStyle w:val="ListParagraph"/>
+        <w:numPr>
+          <w:ilvl w:val="0"/>
+          <w:numId w:val="0"/>
+        </w:numPr>
+        <w:ind w:hanging="0" w:left="360"/>
+        <w:jc w:val="both"/>
+        <w:rPr>
+          <w:rFonts w:ascii="Arial" w:hAnsi="Arial" w:cs="Arial"/>
+          <w:b/>
+          <w:sz w:val="22"/>
+          <w:szCs w:val="22"/>
+        </w:rPr>
+      </w:pPr>
+      <w:r>
+        <w:rPr/>
+      </w:r>
+    </w:p>
+    <w:p>
+      <w:pPr>
+        <w:pStyle w:val="ListParagraph"/>
+        <w:numPr>
+          <w:ilvl w:val="0"/>
+          <w:numId w:val="0"/>
+        </w:numPr>
+        <w:ind w:hanging="0" w:left="360"/>
+        <w:jc w:val="both"/>
+        <w:rPr>
+          <w:rFonts w:ascii="Arial" w:hAnsi="Arial" w:cs="Arial"/>
+          <w:b/>
+          <w:sz w:val="22"/>
+          <w:szCs w:val="22"/>
+        </w:rPr>
+      </w:pPr>
+      <w:r>
+        <w:rPr/>
+      </w:r>
+    </w:p>
+    <w:p>
+      <w:pPr>
+        <w:pStyle w:val="ListParagraph"/>
+        <w:numPr>
+          <w:ilvl w:val="0"/>
+          <w:numId w:val="0"/>
+        </w:numPr>
+        <w:ind w:hanging="0" w:left="360"/>
+        <w:jc w:val="both"/>
+        <w:rPr>
+          <w:rFonts w:ascii="Arial" w:hAnsi="Arial" w:cs="Arial"/>
+          <w:b/>
+          <w:sz w:val="22"/>
+          <w:szCs w:val="22"/>
+        </w:rPr>
+      </w:pPr>
+      <w:r>
+        <w:rPr/>
+      </w:r>
+    </w:p>
+    <w:p>
+      <w:pPr>
+        <w:pStyle w:val="ListParagraph"/>
+        <w:numPr>
+          <w:ilvl w:val="0"/>
+          <w:numId w:val="0"/>
+        </w:numPr>
+        <w:ind w:hanging="0" w:left="360"/>
+        <w:jc w:val="both"/>
+        <w:rPr>
+          <w:rFonts w:ascii="Arial" w:hAnsi="Arial" w:cs="Arial"/>
+          <w:b/>
+          <w:sz w:val="22"/>
+          <w:szCs w:val="22"/>
+        </w:rPr>
+      </w:pPr>
+      <w:r>
+        <w:rPr/>
+      </w:r>
+    </w:p>
+    <w:p>
+      <w:pPr>
+        <w:pStyle w:val="ListParagraph"/>
+        <w:numPr>
+          <w:ilvl w:val="0"/>
+          <w:numId w:val="0"/>
+        </w:numPr>
+        <w:ind w:hanging="0" w:left="360"/>
+        <w:jc w:val="both"/>
+        <w:rPr>
+          <w:rFonts w:ascii="Arial" w:hAnsi="Arial" w:cs="Arial"/>
+          <w:b/>
+          <w:sz w:val="22"/>
+          <w:szCs w:val="22"/>
+        </w:rPr>
+      </w:pPr>
+      <w:r>
+        <w:rPr/>
+      </w:r>
+    </w:p>
+    <w:p>
+      <w:pPr>
+        <w:pStyle w:val="ListParagraph"/>
+        <w:numPr>
+          <w:ilvl w:val="0"/>
+          <w:numId w:val="0"/>
+        </w:numPr>
+        <w:ind w:hanging="0" w:left="360"/>
+        <w:jc w:val="both"/>
+        <w:rPr>
+          <w:rFonts w:ascii="Arial" w:hAnsi="Arial" w:cs="Arial"/>
+          <w:b/>
+          <w:sz w:val="22"/>
+          <w:szCs w:val="22"/>
+        </w:rPr>
+      </w:pPr>
+      <w:r>
+        <w:rPr>
+          <w:rFonts w:cs="Arial" w:ascii="Arial" w:hAnsi="Arial"/>
+          <w:b w:val="false"/>
+          <w:bCs w:val="false"/>
+          <w:sz w:val="22"/>
+          <w:szCs w:val="22"/>
+        </w:rPr>
+        <w:t xml:space="preserve">Às </w:t>
+      </w:r>
+      <w:r>
+        <w:rPr>
+          <w:rFonts w:cs="Arial" w:ascii="Arial" w:hAnsi="Arial"/>
+          <w:b/>
+          <w:bCs/>
+          <w:sz w:val="22"/>
+          <w:szCs w:val="22"/>
+          <w:shd w:fill="FFFF00" w:val="clear"/>
+          <w14:ligatures w14:val="standardContextual"/>
+        </w:rPr>
+        <w:t>{{HoraPericia}}</w:t>
+      </w:r>
+      <w:r>
+        <w:rPr>
+          <w:rFonts w:cs="Arial" w:ascii="Arial" w:hAnsi="Arial"/>
+          <w:b w:val="false"/>
+          <w:bCs w:val="false"/>
+          <w:sz w:val="22"/>
+          <w:szCs w:val="22"/>
+        </w:rPr>
+        <w:t>h do dia  {{DataPericia}}.</w:t>
+      </w:r>
+      <w:r>
+        <w:rPr>
+          <w:rFonts w:cs="Arial" w:ascii="Arial" w:hAnsi="Arial"/>
+          <w:b w:val="false"/>
+          <w:bCs/>
+          <w:sz w:val="22"/>
+          <w:szCs w:val="22"/>
+        </w:rPr>
+        <w:t>Os procedimentos para avaliar sob quais condições o autor desenvolve as suas atividade laborais foram iniciados com o acompanhamento das partes qualificadas no item 3 deste laudo pericial.</w:t>
+      </w:r>
+    </w:p>
+    <w:p>
+      <w:pPr>
+        <w:pStyle w:val="ListParagraph"/>
+        <w:numPr>
+          <w:ilvl w:val="0"/>
+          <w:numId w:val="0"/>
+        </w:numPr>
+        <w:ind w:hanging="0" w:left="360"/>
+        <w:jc w:val="both"/>
+        <w:rPr>
+          <w:rFonts w:ascii="Arial" w:hAnsi="Arial" w:cs="Arial"/>
+          <w:b/>
+          <w:sz w:val="22"/>
+          <w:szCs w:val="22"/>
+        </w:rPr>
+      </w:pPr>
+      <w:r>
+        <w:rPr/>
+      </w:r>
+    </w:p>
+    <w:p>
+      <w:pPr>
+        <w:pStyle w:val="ListParagraph"/>
+        <w:numPr>
+          <w:ilvl w:val="0"/>
+          <w:numId w:val="2"/>
+        </w:numPr>
+        <w:spacing w:lineRule="auto" w:line="259"/>
         <w:ind w:left="360"/>
+        <w:jc w:val="both"/>
         <w:rPr>
           <w:rFonts w:ascii="Arial" w:hAnsi="Arial" w:cs="Arial"/>
           <w:b/>
-          <w:bCs/>
           <w:sz w:val="28"/>
           <w:szCs w:val="28"/>
         </w:rPr>
@@ -1597,920 +1968,228 @@
           <w:sz w:val="28"/>
           <w:szCs w:val="28"/>
         </w:rPr>
+        <w:t>Análise de Documentos</w:t>
       </w:r>
     </w:p>
     <w:p>
       <w:pPr>
         <w:pStyle w:val="ListParagraph"/>
-        <w:numPr>
-          <w:ilvl w:val="0"/>
-          <w:numId w:val="1"/>
-        </w:numPr>
         <w:spacing w:lineRule="auto" w:line="259"/>
+        <w:ind w:left="360"/>
         <w:jc w:val="both"/>
         <w:rPr>
           <w:rFonts w:ascii="Arial" w:hAnsi="Arial" w:cs="Arial"/>
           <w:b/>
-          <w:bCs/>
           <w:sz w:val="28"/>
           <w:szCs w:val="28"/>
         </w:rPr>
       </w:pPr>
       <w:r>
-        <w:rPr>
-          <w:rFonts w:cs="Arial" w:ascii="Arial" w:hAnsi="Arial"/>
-          <w:b/>
-          <w:bCs/>
+        <w:rPr/>
+      </w:r>
+    </w:p>
+    <w:p>
+      <w:pPr>
+        <w:pStyle w:val="ListParagraph"/>
+        <w:spacing w:lineRule="auto" w:line="259"/>
+        <w:ind w:left="360"/>
+        <w:jc w:val="both"/>
+        <w:rPr>
+          <w:rFonts w:ascii="Arial" w:hAnsi="Arial" w:cs="Arial"/>
+          <w:b/>
           <w:sz w:val="28"/>
           <w:szCs w:val="28"/>
         </w:rPr>
-        <w:t>Local de Trabalho</w:t>
+      </w:pPr>
+      <w:r>
+        <w:rPr/>
       </w:r>
     </w:p>
     <w:p>
       <w:pPr>
         <w:pStyle w:val="ListParagraph"/>
+        <w:numPr>
+          <w:ilvl w:val="0"/>
+          <w:numId w:val="2"/>
+        </w:numPr>
+        <w:spacing w:lineRule="auto" w:line="259"/>
         <w:ind w:left="360"/>
         <w:jc w:val="both"/>
         <w:rPr>
-          <w:rFonts w:ascii="Arial" w:hAnsi="Arial" w:cs="Arial"/>
-          <w:bCs/>
-        </w:rPr>
-      </w:pPr>
-      <w:r>
-        <w:rPr>
-          <w:rFonts w:cs="Arial" w:ascii="Arial" w:hAnsi="Arial"/>
-          <w:bCs/>
-        </w:rPr>
+          <w:sz w:val="26"/>
+          <w:szCs w:val="26"/>
+        </w:rPr>
+      </w:pPr>
+      <w:r>
+        <w:rPr>
+          <w:rFonts w:cs="Arial" w:ascii="Arial" w:hAnsi="Arial"/>
+          <w:b/>
+          <w:bCs/>
+          <w:sz w:val="26"/>
+          <w:szCs w:val="26"/>
+        </w:rPr>
+        <w:t>ANÁLISE TÉCN</w:t>
+      </w:r>
+      <w:r>
+        <w:rPr>
+          <w:rFonts w:cs="Arial" w:ascii="Arial" w:hAnsi="Arial"/>
+          <w:b/>
+          <w:bCs/>
+          <w:sz w:val="26"/>
+          <w:szCs w:val="26"/>
+        </w:rPr>
+        <w:t>I</w:t>
+      </w:r>
+      <w:r>
+        <w:rPr>
+          <w:rFonts w:cs="Arial" w:ascii="Arial" w:hAnsi="Arial"/>
+          <w:b/>
+          <w:bCs/>
+          <w:sz w:val="26"/>
+          <w:szCs w:val="26"/>
+        </w:rPr>
+        <w:t>CIA PERICIAL</w:t>
       </w:r>
     </w:p>
     <w:p>
       <w:pPr>
         <w:pStyle w:val="ListParagraph"/>
+        <w:numPr>
+          <w:ilvl w:val="0"/>
+          <w:numId w:val="2"/>
+        </w:numPr>
+        <w:spacing w:lineRule="auto" w:line="259"/>
         <w:ind w:left="360"/>
         <w:jc w:val="both"/>
         <w:rPr>
           <w:rFonts w:ascii="Arial" w:hAnsi="Arial" w:cs="Arial"/>
           <w:b/>
-          <w:sz w:val="22"/>
-          <w:szCs w:val="22"/>
-        </w:rPr>
-      </w:pPr>
-      <w:r>
-        <w:rPr>
-          <w:rFonts w:cs="Arial" w:ascii="Arial" w:hAnsi="Arial"/>
-          <w:bCs/>
-          <w:sz w:val="22"/>
-          <w:szCs w:val="22"/>
-        </w:rPr>
-        <w:t xml:space="preserve">O autor desenvolveu as suas atividades no(a) </w:t>
-      </w:r>
-      <w:r>
-        <w:rPr>
-          <w:rFonts w:cs="Arial" w:ascii="Arial" w:hAnsi="Arial"/>
+          <w:bCs/>
+          <w:sz w:val="28"/>
+          <w:szCs w:val="28"/>
+        </w:rPr>
+      </w:pPr>
+      <w:r>
+        <w:rPr>
+          <w:rFonts w:cs="Arial" w:ascii="Arial" w:hAnsi="Arial"/>
+          <w:b/>
+          <w:bCs/>
+          <w:sz w:val="28"/>
+          <w:szCs w:val="28"/>
+        </w:rPr>
+        <w:t>CONCLUSÃO</w:t>
+      </w:r>
+    </w:p>
+    <w:p>
+      <w:pPr>
+        <w:pStyle w:val="ListParagraph"/>
+        <w:numPr>
+          <w:ilvl w:val="0"/>
+          <w:numId w:val="0"/>
+        </w:numPr>
+        <w:ind w:hanging="0" w:left="360"/>
+        <w:jc w:val="both"/>
+        <w:rPr>
+          <w:rFonts w:ascii="Arial" w:hAnsi="Arial" w:cs="Arial"/>
+          <w:bCs/>
+          <w:sz w:val="22"/>
+          <w:szCs w:val="22"/>
+        </w:rPr>
+      </w:pPr>
+      <w:r>
+        <w:rPr>
+          <w:rFonts w:cs="Arial" w:ascii="Arial" w:hAnsi="Arial"/>
+          <w:bCs/>
+          <w:sz w:val="22"/>
+          <w:szCs w:val="22"/>
+        </w:rPr>
+      </w:r>
+    </w:p>
+    <w:p>
+      <w:pPr>
+        <w:pStyle w:val="meusumrio"/>
+        <w:numPr>
+          <w:ilvl w:val="0"/>
+          <w:numId w:val="0"/>
+        </w:numPr>
+        <w:ind w:hanging="0" w:left="360"/>
+        <w:rPr>
+          <w:b w:val="false"/>
+          <w:bCs/>
+          <w:sz w:val="22"/>
+          <w:szCs w:val="22"/>
+        </w:rPr>
+      </w:pPr>
+      <w:r>
+        <w:rPr>
+          <w:rFonts w:cs="Arial"/>
+          <w:b w:val="false"/>
+          <w:bCs/>
+          <w:sz w:val="22"/>
+          <w:szCs w:val="22"/>
+        </w:rPr>
+        <w:t xml:space="preserve">Com base no resultado das avaliações realizadas a partir das atividades desenvolvidas pelo reclamante, em que os risco potenciais à saúde dos trabalhadores foram analisados e os fatores relacionados a estes identificados, seguindo as orientações expostas pelos artigos 189, 191, 194 e 195 da CLT. Este Laudo Pericial, com fundamentação legal na Lei 6.514/77 e fundamentação técnica nas Normas Regulamentadoras do Ministério do Trabalho. Com metodologia expressa, isenta de subjetividade, concluímos sob a luz dos aspectos de Segurança do Trabalho e da Higiene Ocupacional que: as atividades desenvolvidas pela reclamante estão classificadas como </w:t>
+      </w:r>
+      <w:r>
+        <w:rPr>
+          <w:rFonts w:cs="Arial"/>
           <w:b w:val="false"/>
           <w:bCs w:val="false"/>
           <w:sz w:val="22"/>
           <w:szCs w:val="22"/>
         </w:rPr>
-        <w:t>{{LocalDeTrabalho}}</w:t>
-      </w:r>
-      <w:r>
-        <w:rPr>
-          <w:rFonts w:cs="Arial" w:ascii="Arial" w:hAnsi="Arial"/>
-          <w:bCs/>
-          <w:sz w:val="22"/>
-          <w:szCs w:val="22"/>
-        </w:rPr>
-        <w:t xml:space="preserve"> do(a) reclamado(a), o ambiente se encontra edificado em concreto armado, fechamento em alvenaria, paredes revestidas </w:t>
-      </w:r>
-      <w:r>
-        <w:rPr>
-          <w:rFonts w:cs="Arial" w:ascii="Arial" w:hAnsi="Arial"/>
+        <w:t>{{Classificacao}}</w:t>
+      </w:r>
+      <w:r>
+        <w:rPr>
+          <w:rFonts w:cs="Arial"/>
           <w:b w:val="false"/>
           <w:bCs w:val="false"/>
           <w:sz w:val="22"/>
           <w:szCs w:val="22"/>
-        </w:rPr>
-        <w:t>{{Paredes}},</w:t>
-      </w:r>
-      <w:r>
-        <w:rPr>
-          <w:rFonts w:cs="Arial" w:ascii="Arial" w:hAnsi="Arial"/>
-          <w:bCs/>
-          <w:sz w:val="22"/>
-          <w:szCs w:val="22"/>
-        </w:rPr>
-        <w:t xml:space="preserve"> piso em material </w:t>
-      </w:r>
-      <w:r>
-        <w:rPr>
-          <w:rFonts w:cs="Arial" w:ascii="Arial" w:hAnsi="Arial"/>
+          <w:u w:val="single"/>
+        </w:rPr>
+        <w:t>,</w:t>
+      </w:r>
+      <w:r>
+        <w:rPr>
+          <w:rFonts w:cs="Arial"/>
+          <w:b w:val="false"/>
+          <w:bCs/>
+          <w:sz w:val="22"/>
+          <w:szCs w:val="22"/>
+        </w:rPr>
+        <w:t xml:space="preserve"> nos termos dos anexos (indicados na metodologia) da </w:t>
+      </w:r>
+      <w:r>
+        <w:rPr>
+          <w:rFonts w:cs="Arial"/>
           <w:b w:val="false"/>
           <w:bCs w:val="false"/>
           <w:sz w:val="22"/>
           <w:szCs w:val="22"/>
         </w:rPr>
-        <w:t>{{Pisos}}</w:t>
-      </w:r>
-      <w:r>
-        <w:rPr>
-          <w:rFonts w:cs="Arial" w:ascii="Arial" w:hAnsi="Arial"/>
-          <w:bCs/>
-          <w:sz w:val="22"/>
-          <w:szCs w:val="22"/>
-        </w:rPr>
-        <w:t xml:space="preserve">, iluminação </w:t>
-      </w:r>
-      <w:r>
-        <w:rPr>
-          <w:rFonts w:cs="Arial" w:ascii="Arial" w:hAnsi="Arial"/>
+        <w:t>{{TipoNorma}}</w:t>
+      </w:r>
+      <w:r>
+        <w:rPr>
+          <w:rFonts w:cs="Arial"/>
+          <w:b/>
+          <w:bCs/>
+          <w:sz w:val="22"/>
+          <w:szCs w:val="22"/>
+        </w:rPr>
+        <w:t xml:space="preserve"> </w:t>
+      </w:r>
+      <w:r>
+        <w:rPr>
+          <w:rFonts w:cs="Arial"/>
           <w:b w:val="false"/>
-          <w:bCs w:val="false"/>
-          <w:sz w:val="22"/>
-          <w:szCs w:val="22"/>
-        </w:rPr>
-        <w:t>{{Iluminacao}}</w:t>
-      </w:r>
-      <w:r>
-        <w:rPr>
-          <w:rFonts w:cs="Arial" w:ascii="Arial" w:hAnsi="Arial"/>
-          <w:bCs/>
-          <w:sz w:val="22"/>
-          <w:szCs w:val="22"/>
-        </w:rPr>
-        <w:t xml:space="preserve"> , Ventilação </w:t>
-      </w:r>
-      <w:r>
-        <w:rPr>
-          <w:rFonts w:cs="Arial" w:ascii="Arial" w:hAnsi="Arial"/>
-          <w:b w:val="false"/>
-          <w:bCs w:val="false"/>
-          <w:sz w:val="22"/>
-          <w:szCs w:val="22"/>
-        </w:rPr>
-        <w:t>{{Ventilacao}}</w:t>
-      </w:r>
-    </w:p>
-    <w:p>
-      <w:pPr>
-        <w:pStyle w:val="ListParagraph"/>
-        <w:ind w:left="360"/>
-        <w:jc w:val="both"/>
-        <w:rPr>
-          <w:rFonts w:ascii="Arial" w:hAnsi="Arial" w:cs="Arial"/>
-          <w:bCs/>
-        </w:rPr>
-      </w:pPr>
-      <w:r>
-        <w:rPr>
-          <w:rFonts w:cs="Arial" w:ascii="Arial" w:hAnsi="Arial"/>
-          <w:bCs/>
-        </w:rPr>
-      </w:r>
-    </w:p>
-    <w:p>
-      <w:pPr>
-        <w:pStyle w:val="ListParagraph"/>
-        <w:ind w:left="360"/>
-        <w:jc w:val="both"/>
-        <w:rPr>
-          <w:rFonts w:ascii="Arial" w:hAnsi="Arial" w:cs="Arial"/>
-          <w:bCs/>
-        </w:rPr>
-      </w:pPr>
-      <w:r>
-        <w:rPr>
-          <w:rFonts w:cs="Arial" w:ascii="Arial" w:hAnsi="Arial"/>
-          <w:bCs/>
-        </w:rPr>
-      </w:r>
-    </w:p>
-    <w:p>
-      <w:pPr>
-        <w:pStyle w:val="ListParagraph"/>
-        <w:ind w:left="360"/>
-        <w:jc w:val="both"/>
-        <w:rPr>
-          <w:rFonts w:ascii="Arial" w:hAnsi="Arial" w:cs="Arial"/>
-          <w:bCs/>
-        </w:rPr>
-      </w:pPr>
-      <w:r>
-        <w:rPr>
-          <w:rFonts w:cs="Arial" w:ascii="Arial" w:hAnsi="Arial"/>
-          <w:bCs/>
-        </w:rPr>
-      </w:r>
-    </w:p>
-    <w:p>
-      <w:pPr>
-        <w:pStyle w:val="ListParagraph"/>
-        <w:ind w:left="360"/>
-        <w:jc w:val="both"/>
-        <w:rPr>
-          <w:rFonts w:ascii="Arial" w:hAnsi="Arial" w:cs="Arial"/>
-          <w:bCs/>
-        </w:rPr>
-      </w:pPr>
-      <w:r>
-        <w:rPr>
-          <w:rFonts w:cs="Arial" w:ascii="Arial" w:hAnsi="Arial"/>
-          <w:bCs/>
-        </w:rPr>
-      </w:r>
-    </w:p>
-    <w:p>
-      <w:pPr>
-        <w:pStyle w:val="ListParagraph"/>
-        <w:ind w:left="360"/>
-        <w:jc w:val="both"/>
-        <w:rPr>
-          <w:rFonts w:ascii="Arial" w:hAnsi="Arial" w:cs="Arial"/>
-          <w:bCs/>
-        </w:rPr>
-      </w:pPr>
-      <w:r>
-        <w:rPr>
-          <w:rFonts w:cs="Arial" w:ascii="Arial" w:hAnsi="Arial"/>
-          <w:bCs/>
-        </w:rPr>
-      </w:r>
-    </w:p>
-    <w:p>
-      <w:pPr>
-        <w:pStyle w:val="ListParagraph"/>
-        <w:ind w:left="360"/>
-        <w:jc w:val="both"/>
-        <w:rPr>
-          <w:rFonts w:ascii="Arial" w:hAnsi="Arial" w:cs="Arial"/>
-          <w:bCs/>
-        </w:rPr>
-      </w:pPr>
-      <w:r>
-        <w:rPr>
-          <w:rFonts w:cs="Arial" w:ascii="Arial" w:hAnsi="Arial"/>
-          <w:bCs/>
-        </w:rPr>
-      </w:r>
-    </w:p>
-    <w:p>
-      <w:pPr>
-        <w:pStyle w:val="ListParagraph"/>
-        <w:ind w:left="360"/>
-        <w:jc w:val="both"/>
-        <w:rPr>
-          <w:rFonts w:ascii="Arial" w:hAnsi="Arial" w:cs="Arial"/>
-          <w:bCs/>
-        </w:rPr>
-      </w:pPr>
-      <w:r>
-        <w:rPr>
-          <w:rFonts w:cs="Arial" w:ascii="Arial" w:hAnsi="Arial"/>
-          <w:bCs/>
-        </w:rPr>
-      </w:r>
-    </w:p>
-    <w:p>
-      <w:pPr>
-        <w:pStyle w:val="ListParagraph"/>
-        <w:ind w:left="360"/>
-        <w:jc w:val="both"/>
-        <w:rPr>
-          <w:rFonts w:ascii="Arial" w:hAnsi="Arial" w:cs="Arial"/>
-          <w:bCs/>
-        </w:rPr>
-      </w:pPr>
-      <w:r>
-        <w:rPr>
-          <w:rFonts w:cs="Arial" w:ascii="Arial" w:hAnsi="Arial"/>
-          <w:bCs/>
-        </w:rPr>
-      </w:r>
-    </w:p>
-    <w:p>
-      <w:pPr>
-        <w:pStyle w:val="ListParagraph"/>
-        <w:ind w:left="360"/>
-        <w:jc w:val="both"/>
-        <w:rPr>
-          <w:rFonts w:ascii="Arial" w:hAnsi="Arial" w:cs="Arial"/>
-          <w:bCs/>
-        </w:rPr>
-      </w:pPr>
-      <w:r>
-        <w:rPr>
-          <w:rFonts w:cs="Arial" w:ascii="Arial" w:hAnsi="Arial"/>
-          <w:bCs/>
-        </w:rPr>
-      </w:r>
-    </w:p>
-    <w:p>
-      <w:pPr>
-        <w:pStyle w:val="ListParagraph"/>
-        <w:ind w:left="360"/>
-        <w:jc w:val="both"/>
-        <w:rPr>
-          <w:rFonts w:ascii="Arial" w:hAnsi="Arial" w:cs="Arial"/>
-          <w:bCs/>
-        </w:rPr>
-      </w:pPr>
-      <w:r>
-        <w:rPr>
-          <w:rFonts w:cs="Arial" w:ascii="Arial" w:hAnsi="Arial"/>
-          <w:bCs/>
-        </w:rPr>
-      </w:r>
-    </w:p>
-    <w:p>
-      <w:pPr>
-        <w:pStyle w:val="ListParagraph"/>
-        <w:jc w:val="both"/>
-        <w:rPr>
-          <w:rFonts w:ascii="Arial" w:hAnsi="Arial" w:cs="Arial"/>
-          <w:sz w:val="22"/>
-          <w:szCs w:val="22"/>
-        </w:rPr>
-      </w:pPr>
-      <w:r>
-        <w:rPr>
-          <w:rFonts w:cs="Arial" w:ascii="Arial" w:hAnsi="Arial"/>
-          <w:sz w:val="22"/>
-          <w:szCs w:val="22"/>
-        </w:rPr>
-        <w:t>Descrição das Atividades da Reclamante</w:t>
-      </w:r>
-    </w:p>
-    <w:p>
-      <w:pPr>
-        <w:pStyle w:val="ListParagraph"/>
-        <w:jc w:val="both"/>
-        <w:rPr>
-          <w:rFonts w:ascii="Arial" w:hAnsi="Arial" w:cs="Arial"/>
-          <w:bCs/>
-          <w:sz w:val="22"/>
-          <w:szCs w:val="22"/>
-        </w:rPr>
-      </w:pPr>
-      <w:r>
-        <w:rPr>
-          <w:rFonts w:cs="Arial" w:ascii="Arial" w:hAnsi="Arial"/>
-          <w:sz w:val="22"/>
-          <w:szCs w:val="22"/>
-        </w:rPr>
-        <w:t xml:space="preserve">Às </w:t>
-      </w:r>
-      <w:r>
-        <w:rPr>
-          <w:rFonts w:cs="Arial" w:ascii="Arial" w:hAnsi="Arial"/>
-          <w:b/>
-          <w:bCs/>
-          <w:sz w:val="22"/>
-          <w:szCs w:val="22"/>
-          <w:shd w:fill="FFFF00" w:val="clear"/>
-          <w14:ligatures w14:val="standardContextual"/>
-        </w:rPr>
-        <w:t>{{HoraPericia}}</w:t>
-      </w:r>
-      <w:r>
-        <w:rPr>
-          <w:rFonts w:cs="Arial" w:ascii="Arial" w:hAnsi="Arial"/>
-          <w:sz w:val="22"/>
-          <w:szCs w:val="22"/>
-        </w:rPr>
-        <w:t xml:space="preserve">h do dia  </w:t>
-      </w:r>
-      <w:r>
-        <w:rPr>
-          <w:rFonts w:cs="Arial" w:ascii="Arial" w:hAnsi="Arial"/>
-          <w:b w:val="false"/>
-          <w:bCs w:val="false"/>
-          <w:sz w:val="22"/>
-          <w:szCs w:val="22"/>
-        </w:rPr>
-        <w:t>{{DataPericia}}</w:t>
-      </w:r>
-      <w:r>
-        <w:rPr>
-          <w:rFonts w:cs="Arial" w:ascii="Arial" w:hAnsi="Arial"/>
-          <w:sz w:val="22"/>
-          <w:szCs w:val="22"/>
-        </w:rPr>
-        <w:t>.</w:t>
-      </w:r>
-      <w:r>
-        <w:rPr>
-          <w:rFonts w:cs="Arial" w:ascii="Arial" w:hAnsi="Arial"/>
-          <w:bCs/>
-          <w:sz w:val="22"/>
-          <w:szCs w:val="22"/>
-        </w:rPr>
-        <w:t>Os procedimentos para avaliar sob quais condições o autor desenvolve as suas atividade laborais foram iniciados com o acompanhamento das partes qualificadas no item 3 deste laudo pericial.</w:t>
-      </w:r>
-    </w:p>
-    <w:p>
-      <w:pPr>
-        <w:pStyle w:val="ListParagraph"/>
-        <w:jc w:val="both"/>
-        <w:rPr>
-          <w:rFonts w:ascii="Arial" w:hAnsi="Arial" w:cs="Arial"/>
-          <w:bCs/>
-          <w:sz w:val="22"/>
-          <w:szCs w:val="22"/>
-        </w:rPr>
-      </w:pPr>
-      <w:r>
-        <w:rPr>
-          <w:rFonts w:cs="Arial" w:ascii="Arial" w:hAnsi="Arial"/>
-          <w:bCs/>
-          <w:sz w:val="22"/>
-          <w:szCs w:val="22"/>
-        </w:rPr>
-      </w:r>
-    </w:p>
-    <w:p>
-      <w:pPr>
-        <w:pStyle w:val="ListParagraph"/>
-        <w:jc w:val="both"/>
-        <w:rPr>
-          <w:rFonts w:ascii="Arial" w:hAnsi="Arial" w:cs="Arial"/>
-          <w:bCs/>
-          <w:sz w:val="22"/>
-          <w:szCs w:val="22"/>
-        </w:rPr>
-      </w:pPr>
-      <w:r>
-        <w:rPr>
-          <w:rFonts w:cs="Arial" w:ascii="Arial" w:hAnsi="Arial"/>
-          <w:bCs/>
-          <w:sz w:val="22"/>
-          <w:szCs w:val="22"/>
-        </w:rPr>
-      </w:r>
-    </w:p>
-    <w:p>
-      <w:pPr>
-        <w:pStyle w:val="Normal"/>
-        <w:rPr>
-          <w:rFonts w:ascii="Arial" w:hAnsi="Arial" w:cs="Arial"/>
-          <w:bCs/>
-          <w:sz w:val="22"/>
-          <w:szCs w:val="22"/>
-        </w:rPr>
-      </w:pPr>
-      <w:r>
-        <w:rPr>
-          <w:rFonts w:cs="Arial" w:ascii="Arial" w:hAnsi="Arial"/>
-          <w:bCs/>
-          <w:sz w:val="22"/>
-          <w:szCs w:val="22"/>
-        </w:rPr>
-      </w:r>
-    </w:p>
-    <w:p>
-      <w:pPr>
-        <w:pStyle w:val="Normal"/>
-        <w:jc w:val="both"/>
-        <w:rPr>
-          <w:rFonts w:ascii="Arial" w:hAnsi="Arial" w:cs="Arial"/>
-          <w:bCs/>
-          <w:sz w:val="22"/>
-          <w:szCs w:val="22"/>
-        </w:rPr>
-      </w:pPr>
-      <w:r>
-        <w:rPr>
-          <w:rFonts w:cs="Arial" w:ascii="Arial" w:hAnsi="Arial"/>
-          <w:bCs/>
-          <w:sz w:val="22"/>
-          <w:szCs w:val="22"/>
-        </w:rPr>
-      </w:r>
-    </w:p>
-    <w:p>
-      <w:pPr>
-        <w:pStyle w:val="ListParagraph"/>
-        <w:numPr>
-          <w:ilvl w:val="0"/>
-          <w:numId w:val="1"/>
-        </w:numPr>
-        <w:spacing w:lineRule="auto" w:line="259"/>
-        <w:jc w:val="both"/>
-        <w:rPr>
-          <w:rFonts w:ascii="Arial" w:hAnsi="Arial" w:cs="Arial"/>
-          <w:b/>
-          <w:sz w:val="28"/>
-          <w:szCs w:val="28"/>
-        </w:rPr>
-      </w:pPr>
-      <w:r>
-        <w:rPr>
-          <w:rFonts w:cs="Arial" w:ascii="Arial" w:hAnsi="Arial"/>
-          <w:b/>
-          <w:sz w:val="28"/>
-          <w:szCs w:val="28"/>
-        </w:rPr>
-        <w:t>Análise de Documentos</w:t>
-      </w:r>
-    </w:p>
-    <w:p>
-      <w:pPr>
-        <w:pStyle w:val="Normal"/>
-        <w:jc w:val="both"/>
-        <w:rPr>
-          <w:rFonts w:ascii="Arial" w:hAnsi="Arial" w:cs="Arial"/>
-          <w:bCs/>
-          <w:sz w:val="22"/>
-          <w:szCs w:val="22"/>
-        </w:rPr>
-      </w:pPr>
-      <w:r>
-        <w:rPr>
-          <w:rFonts w:cs="Arial" w:ascii="Arial" w:hAnsi="Arial"/>
-          <w:bCs/>
-          <w:sz w:val="22"/>
-          <w:szCs w:val="22"/>
-        </w:rPr>
-      </w:r>
-    </w:p>
-    <w:p>
-      <w:pPr>
-        <w:pStyle w:val="Normal"/>
-        <w:jc w:val="both"/>
-        <w:rPr>
-          <w:rFonts w:ascii="Arial" w:hAnsi="Arial" w:cs="Arial"/>
-          <w:bCs/>
-          <w:sz w:val="22"/>
-          <w:szCs w:val="22"/>
-        </w:rPr>
-      </w:pPr>
-      <w:r>
-        <w:rPr>
-          <w:rFonts w:cs="Arial" w:ascii="Arial" w:hAnsi="Arial"/>
-          <w:bCs/>
-          <w:sz w:val="22"/>
-          <w:szCs w:val="22"/>
-        </w:rPr>
-      </w:r>
-    </w:p>
-    <w:p>
-      <w:pPr>
-        <w:pStyle w:val="Normal"/>
-        <w:jc w:val="both"/>
-        <w:rPr>
-          <w:rFonts w:ascii="Arial" w:hAnsi="Arial" w:cs="Arial"/>
-          <w:bCs/>
-          <w:sz w:val="22"/>
-          <w:szCs w:val="22"/>
-        </w:rPr>
-      </w:pPr>
-      <w:r>
-        <w:rPr>
-          <w:rFonts w:cs="Arial" w:ascii="Arial" w:hAnsi="Arial"/>
-          <w:bCs/>
-          <w:sz w:val="22"/>
-          <w:szCs w:val="22"/>
-        </w:rPr>
-      </w:r>
-    </w:p>
-    <w:p>
-      <w:pPr>
-        <w:pStyle w:val="ListParagraph"/>
-        <w:numPr>
-          <w:ilvl w:val="0"/>
-          <w:numId w:val="1"/>
-        </w:numPr>
-        <w:spacing w:lineRule="auto" w:line="259"/>
-        <w:jc w:val="both"/>
-        <w:rPr>
-          <w:rFonts w:ascii="Arial" w:hAnsi="Arial" w:cs="Arial"/>
-          <w:b/>
-          <w:bCs/>
-        </w:rPr>
-      </w:pPr>
-      <w:r>
-        <w:rPr>
-          <w:rFonts w:cs="Arial" w:ascii="Arial" w:hAnsi="Arial"/>
-          <w:b/>
-          <w:bCs/>
-        </w:rPr>
-        <w:t>ANÁLISE TÉCNCIA PERICIAL</w:t>
-      </w:r>
-    </w:p>
-    <w:p>
-      <w:pPr>
-        <w:pStyle w:val="ListParagraph"/>
-        <w:ind w:left="360"/>
-        <w:jc w:val="both"/>
-        <w:rPr>
-          <w:rFonts w:ascii="Arial" w:hAnsi="Arial" w:cs="Arial"/>
-          <w:bCs/>
-          <w:sz w:val="22"/>
-          <w:szCs w:val="22"/>
-        </w:rPr>
-      </w:pPr>
-      <w:r>
-        <w:rPr>
-          <w:rFonts w:cs="Arial" w:ascii="Arial" w:hAnsi="Arial"/>
-          <w:bCs/>
-          <w:sz w:val="22"/>
-          <w:szCs w:val="22"/>
-        </w:rPr>
-      </w:r>
-    </w:p>
-    <w:p>
-      <w:pPr>
-        <w:pStyle w:val="ListParagraph"/>
-        <w:ind w:left="360"/>
-        <w:jc w:val="both"/>
-        <w:rPr>
-          <w:rFonts w:ascii="Arial" w:hAnsi="Arial" w:cs="Arial"/>
-          <w:bCs/>
-          <w:sz w:val="22"/>
-          <w:szCs w:val="22"/>
-        </w:rPr>
-      </w:pPr>
-      <w:r>
-        <w:rPr>
-          <w:rFonts w:cs="Arial" w:ascii="Arial" w:hAnsi="Arial"/>
-          <w:bCs/>
-          <w:sz w:val="22"/>
-          <w:szCs w:val="22"/>
-        </w:rPr>
-      </w:r>
-    </w:p>
-    <w:p>
-      <w:pPr>
-        <w:pStyle w:val="ListParagraph"/>
-        <w:ind w:left="360"/>
-        <w:jc w:val="both"/>
-        <w:rPr>
-          <w:rFonts w:ascii="Arial" w:hAnsi="Arial" w:cs="Arial"/>
-          <w:bCs/>
-          <w:sz w:val="22"/>
-          <w:szCs w:val="22"/>
-        </w:rPr>
-      </w:pPr>
-      <w:r>
-        <w:rPr>
-          <w:rFonts w:cs="Arial" w:ascii="Arial" w:hAnsi="Arial"/>
-          <w:bCs/>
-          <w:sz w:val="22"/>
-          <w:szCs w:val="22"/>
-        </w:rPr>
-      </w:r>
-    </w:p>
-    <w:p>
-      <w:pPr>
-        <w:pStyle w:val="ListParagraph"/>
-        <w:ind w:left="360"/>
-        <w:jc w:val="both"/>
-        <w:rPr>
-          <w:rFonts w:ascii="Arial" w:hAnsi="Arial" w:cs="Arial"/>
-          <w:bCs/>
-          <w:sz w:val="22"/>
-          <w:szCs w:val="22"/>
-        </w:rPr>
-      </w:pPr>
-      <w:r>
-        <w:rPr>
-          <w:rFonts w:cs="Arial" w:ascii="Arial" w:hAnsi="Arial"/>
-          <w:bCs/>
-          <w:sz w:val="22"/>
-          <w:szCs w:val="22"/>
-        </w:rPr>
-      </w:r>
-    </w:p>
-    <w:p>
-      <w:pPr>
-        <w:pStyle w:val="ListParagraph"/>
-        <w:ind w:left="360"/>
-        <w:jc w:val="both"/>
-        <w:rPr>
-          <w:rFonts w:ascii="Arial" w:hAnsi="Arial" w:cs="Arial"/>
-          <w:bCs/>
-          <w:sz w:val="22"/>
-          <w:szCs w:val="22"/>
-        </w:rPr>
-      </w:pPr>
-      <w:r>
-        <w:rPr>
-          <w:rFonts w:cs="Arial" w:ascii="Arial" w:hAnsi="Arial"/>
-          <w:bCs/>
-          <w:sz w:val="22"/>
-          <w:szCs w:val="22"/>
-        </w:rPr>
-      </w:r>
-    </w:p>
-    <w:p>
-      <w:pPr>
-        <w:pStyle w:val="ListParagraph"/>
-        <w:numPr>
-          <w:ilvl w:val="0"/>
-          <w:numId w:val="1"/>
-        </w:numPr>
-        <w:spacing w:lineRule="auto" w:line="259"/>
-        <w:jc w:val="both"/>
-        <w:rPr>
-          <w:rFonts w:ascii="Arial" w:hAnsi="Arial" w:cs="Arial"/>
-          <w:b/>
-          <w:bCs/>
-          <w:sz w:val="28"/>
-          <w:szCs w:val="28"/>
-        </w:rPr>
-      </w:pPr>
-      <w:r>
-        <w:rPr>
-          <w:rFonts w:cs="Arial" w:ascii="Arial" w:hAnsi="Arial"/>
-          <w:b/>
-          <w:bCs/>
-          <w:sz w:val="28"/>
-          <w:szCs w:val="28"/>
-        </w:rPr>
-        <w:t>CONCLUSÃO</w:t>
-      </w:r>
-    </w:p>
-    <w:p>
-      <w:pPr>
-        <w:pStyle w:val="ListParagraph"/>
-        <w:ind w:left="360"/>
-        <w:jc w:val="both"/>
-        <w:rPr>
-          <w:rFonts w:ascii="Arial" w:hAnsi="Arial" w:cs="Arial"/>
-          <w:bCs/>
-          <w:sz w:val="22"/>
-          <w:szCs w:val="22"/>
-        </w:rPr>
-      </w:pPr>
-      <w:r>
-        <w:rPr>
-          <w:rFonts w:cs="Arial" w:ascii="Arial" w:hAnsi="Arial"/>
-          <w:bCs/>
-          <w:sz w:val="22"/>
-          <w:szCs w:val="22"/>
-        </w:rPr>
-      </w:r>
-    </w:p>
-    <w:p>
-      <w:pPr>
-        <w:pStyle w:val="meusumrio"/>
-        <w:rPr>
-          <w:b w:val="false"/>
-          <w:bCs/>
-          <w:sz w:val="22"/>
-          <w:szCs w:val="22"/>
-        </w:rPr>
-      </w:pPr>
-      <w:r>
-        <w:rPr>
-          <w:b w:val="false"/>
-          <w:bCs/>
-          <w:sz w:val="22"/>
-          <w:szCs w:val="22"/>
-        </w:rPr>
-        <w:t xml:space="preserve">Com base no resultado das avaliações realizadas a partir das atividades desenvolvidas pelo reclamante, em que os risco potenciais à saúde dos trabalhadores foram analisados e os fatores relacionados a estes identificados, seguindo as orientações expostas pelos artigos 189, 191, 194 e 195 da CLT. Este Laudo Pericial, com fundamentação legal na Lei 6.514/77 e fundamentação técnica nas Normas Regulamentadoras do Ministério do Trabalho. Com metodologia expressa, isenta de subjetividade, concluímos sob a luz dos aspectos de Segurança do Trabalho e da Higiene Ocupacional que: as atividades desenvolvidas pela reclamante estão classificadas como </w:t>
-      </w:r>
-      <w:r>
-        <w:rPr>
-          <w:b w:val="false"/>
-          <w:bCs w:val="false"/>
-          <w:sz w:val="22"/>
-          <w:szCs w:val="22"/>
-        </w:rPr>
-        <w:t>{{Classificacao}}</w:t>
-      </w:r>
-      <w:r>
-        <w:rPr>
-          <w:b w:val="false"/>
-          <w:bCs w:val="false"/>
-          <w:sz w:val="22"/>
-          <w:szCs w:val="22"/>
-          <w:u w:val="single"/>
-        </w:rPr>
-        <w:t>,</w:t>
-      </w:r>
-      <w:r>
-        <w:rPr>
-          <w:b w:val="false"/>
-          <w:bCs/>
-          <w:sz w:val="22"/>
-          <w:szCs w:val="22"/>
-        </w:rPr>
-        <w:t xml:space="preserve"> nos termos dos anexos (indicados na metodologia) da </w:t>
-      </w:r>
-      <w:r>
-        <w:rPr>
-          <w:b w:val="false"/>
-          <w:bCs w:val="false"/>
-          <w:sz w:val="22"/>
-          <w:szCs w:val="22"/>
-        </w:rPr>
-        <w:t>{{TipoNorma}}</w:t>
-      </w:r>
-      <w:r>
-        <w:rPr>
-          <w:sz w:val="22"/>
-          <w:szCs w:val="22"/>
-        </w:rPr>
-        <w:t xml:space="preserve"> </w:t>
-      </w:r>
-      <w:r>
-        <w:rPr>
-          <w:b w:val="false"/>
           <w:bCs/>
           <w:sz w:val="22"/>
           <w:szCs w:val="22"/>
         </w:rPr>
         <w:t>Portaria 3214/78 do MTb.</w:t>
-      </w:r>
-    </w:p>
-    <w:p>
-      <w:pPr>
-        <w:pStyle w:val="ListParagraph"/>
-        <w:ind w:left="360"/>
-        <w:jc w:val="both"/>
-        <w:rPr>
-          <w:rFonts w:ascii="Arial" w:hAnsi="Arial" w:cs="Arial"/>
-          <w:bCs/>
-          <w:sz w:val="22"/>
-          <w:szCs w:val="22"/>
-        </w:rPr>
-      </w:pPr>
-      <w:r>
-        <w:rPr>
-          <w:rFonts w:cs="Arial" w:ascii="Arial" w:hAnsi="Arial"/>
-          <w:bCs/>
-          <w:sz w:val="22"/>
-          <w:szCs w:val="22"/>
-        </w:rPr>
-      </w:r>
-    </w:p>
-    <w:p>
-      <w:pPr>
-        <w:pStyle w:val="ListParagraph"/>
-        <w:ind w:left="360"/>
-        <w:jc w:val="both"/>
-        <w:rPr>
-          <w:rFonts w:ascii="Arial" w:hAnsi="Arial" w:cs="Arial"/>
-          <w:bCs/>
-        </w:rPr>
-      </w:pPr>
-      <w:r>
-        <w:rPr>
-          <w:rFonts w:cs="Arial" w:ascii="Arial" w:hAnsi="Arial"/>
-          <w:bCs/>
-        </w:rPr>
-      </w:r>
-    </w:p>
-    <w:p>
-      <w:pPr>
-        <w:pStyle w:val="ListParagraph"/>
-        <w:ind w:left="360"/>
-        <w:rPr>
-          <w:rFonts w:ascii="Arial" w:hAnsi="Arial" w:cs="Arial"/>
-          <w:b/>
-          <w:bCs/>
-          <w:sz w:val="28"/>
-          <w:szCs w:val="28"/>
-        </w:rPr>
-      </w:pPr>
-      <w:r>
-        <w:rPr>
-          <w:rFonts w:cs="Arial" w:ascii="Arial" w:hAnsi="Arial"/>
-          <w:b/>
-          <w:bCs/>
-          <w:sz w:val="28"/>
-          <w:szCs w:val="28"/>
-        </w:rPr>
-      </w:r>
-    </w:p>
-    <w:p>
-      <w:pPr>
-        <w:pStyle w:val="Normal"/>
-        <w:rPr>
-          <w:rFonts w:ascii="Arial" w:hAnsi="Arial" w:cs="Arial"/>
-          <w:b/>
-          <w:bCs/>
-        </w:rPr>
-      </w:pPr>
-      <w:r>
-        <w:rPr>
-          <w:rFonts w:cs="Arial" w:ascii="Arial" w:hAnsi="Arial"/>
-          <w:b/>
-          <w:bCs/>
-        </w:rPr>
-      </w:r>
-    </w:p>
-    <w:p>
-      <w:pPr>
-        <w:pStyle w:val="ListParagraph"/>
-        <w:spacing w:before="0" w:after="160"/>
-        <w:ind w:left="720"/>
-        <w:contextualSpacing/>
-        <w:rPr/>
-      </w:pPr>
-      <w:r>
-        <w:rPr/>
       </w:r>
     </w:p>
     <w:sectPr>
@@ -2921,40 +2600,35 @@
       <w:lvlJc w:val="left"/>
       <w:pPr>
         <w:tabs>
-          <w:tab w:val="num" w:pos="0"/>
+          <w:tab w:val="num" w:pos="720"/>
         </w:tabs>
-        <w:ind w:left="360" w:hanging="360"/>
-      </w:pPr>
-      <w:rPr>
-        <w:sz w:val="28"/>
-        <w:b/>
-        <w:szCs w:val="28"/>
-        <w:bCs/>
-      </w:rPr>
+        <w:ind w:left="720" w:hanging="360"/>
+      </w:pPr>
+      <w:rPr/>
     </w:lvl>
     <w:lvl w:ilvl="1">
       <w:start w:val="1"/>
-      <w:numFmt w:val="lowerLetter"/>
+      <w:numFmt w:val="decimal"/>
       <w:lvlText w:val="%2."/>
       <w:lvlJc w:val="left"/>
       <w:pPr>
         <w:tabs>
-          <w:tab w:val="num" w:pos="0"/>
+          <w:tab w:val="num" w:pos="1080"/>
         </w:tabs>
-        <w:ind w:left="1440" w:hanging="360"/>
+        <w:ind w:left="1080" w:hanging="360"/>
       </w:pPr>
       <w:rPr/>
     </w:lvl>
     <w:lvl w:ilvl="2">
       <w:start w:val="1"/>
-      <w:numFmt w:val="lowerRoman"/>
+      <w:numFmt w:val="decimal"/>
       <w:lvlText w:val="%3."/>
-      <w:lvlJc w:val="right"/>
+      <w:lvlJc w:val="left"/>
       <w:pPr>
         <w:tabs>
-          <w:tab w:val="num" w:pos="0"/>
+          <w:tab w:val="num" w:pos="1440"/>
         </w:tabs>
-        <w:ind w:left="2160" w:hanging="180"/>
+        <w:ind w:left="1440" w:hanging="360"/>
       </w:pPr>
       <w:rPr/>
     </w:lvl>
@@ -2965,35 +2639,35 @@
       <w:lvlJc w:val="left"/>
       <w:pPr>
         <w:tabs>
-          <w:tab w:val="num" w:pos="0"/>
+          <w:tab w:val="num" w:pos="1800"/>
         </w:tabs>
-        <w:ind w:left="2880" w:hanging="360"/>
+        <w:ind w:left="1800" w:hanging="360"/>
       </w:pPr>
       <w:rPr/>
     </w:lvl>
     <w:lvl w:ilvl="4">
       <w:start w:val="1"/>
-      <w:numFmt w:val="lowerLetter"/>
+      <w:numFmt w:val="decimal"/>
       <w:lvlText w:val="%5."/>
       <w:lvlJc w:val="left"/>
       <w:pPr>
         <w:tabs>
-          <w:tab w:val="num" w:pos="0"/>
+          <w:tab w:val="num" w:pos="2160"/>
         </w:tabs>
-        <w:ind w:left="3600" w:hanging="360"/>
+        <w:ind w:left="2160" w:hanging="360"/>
       </w:pPr>
       <w:rPr/>
     </w:lvl>
     <w:lvl w:ilvl="5">
       <w:start w:val="1"/>
-      <w:numFmt w:val="lowerRoman"/>
+      <w:numFmt w:val="decimal"/>
       <w:lvlText w:val="%6."/>
-      <w:lvlJc w:val="right"/>
+      <w:lvlJc w:val="left"/>
       <w:pPr>
         <w:tabs>
-          <w:tab w:val="num" w:pos="0"/>
+          <w:tab w:val="num" w:pos="2520"/>
         </w:tabs>
-        <w:ind w:left="4320" w:hanging="180"/>
+        <w:ind w:left="2520" w:hanging="360"/>
       </w:pPr>
       <w:rPr/>
     </w:lvl>
@@ -3004,40 +2678,186 @@
       <w:lvlJc w:val="left"/>
       <w:pPr>
         <w:tabs>
-          <w:tab w:val="num" w:pos="0"/>
+          <w:tab w:val="num" w:pos="2880"/>
         </w:tabs>
-        <w:ind w:left="5040" w:hanging="360"/>
+        <w:ind w:left="2880" w:hanging="360"/>
       </w:pPr>
       <w:rPr/>
     </w:lvl>
     <w:lvl w:ilvl="7">
       <w:start w:val="1"/>
-      <w:numFmt w:val="lowerLetter"/>
+      <w:numFmt w:val="decimal"/>
       <w:lvlText w:val="%8."/>
       <w:lvlJc w:val="left"/>
       <w:pPr>
         <w:tabs>
-          <w:tab w:val="num" w:pos="0"/>
+          <w:tab w:val="num" w:pos="3240"/>
         </w:tabs>
-        <w:ind w:left="5760" w:hanging="360"/>
+        <w:ind w:left="3240" w:hanging="360"/>
       </w:pPr>
       <w:rPr/>
     </w:lvl>
     <w:lvl w:ilvl="8">
       <w:start w:val="1"/>
-      <w:numFmt w:val="lowerRoman"/>
+      <w:numFmt w:val="decimal"/>
       <w:lvlText w:val="%9."/>
-      <w:lvlJc w:val="right"/>
+      <w:lvlJc w:val="left"/>
       <w:pPr>
         <w:tabs>
-          <w:tab w:val="num" w:pos="0"/>
+          <w:tab w:val="num" w:pos="3600"/>
         </w:tabs>
-        <w:ind w:left="6480" w:hanging="180"/>
+        <w:ind w:left="3600" w:hanging="360"/>
       </w:pPr>
       <w:rPr/>
     </w:lvl>
   </w:abstractNum>
   <w:abstractNum w:abstractNumId="2">
+    <w:lvl w:ilvl="0">
+      <w:start w:val="1"/>
+      <w:numFmt w:val="decimal"/>
+      <w:lvlText w:val="%1."/>
+      <w:lvlJc w:val="left"/>
+      <w:pPr>
+        <w:tabs>
+          <w:tab w:val="num" w:pos="720"/>
+        </w:tabs>
+        <w:ind w:left="720" w:hanging="360"/>
+      </w:pPr>
+      <w:rPr>
+        <w:b/>
+        <w:bCs/>
+      </w:rPr>
+    </w:lvl>
+    <w:lvl w:ilvl="1">
+      <w:start w:val="1"/>
+      <w:numFmt w:val="decimal"/>
+      <w:lvlText w:val="%2."/>
+      <w:lvlJc w:val="left"/>
+      <w:pPr>
+        <w:tabs>
+          <w:tab w:val="num" w:pos="1080"/>
+        </w:tabs>
+        <w:ind w:left="1080" w:hanging="360"/>
+      </w:pPr>
+      <w:rPr>
+        <w:b/>
+        <w:bCs/>
+      </w:rPr>
+    </w:lvl>
+    <w:lvl w:ilvl="2">
+      <w:start w:val="1"/>
+      <w:numFmt w:val="decimal"/>
+      <w:lvlText w:val="%3."/>
+      <w:lvlJc w:val="left"/>
+      <w:pPr>
+        <w:tabs>
+          <w:tab w:val="num" w:pos="1440"/>
+        </w:tabs>
+        <w:ind w:left="1440" w:hanging="360"/>
+      </w:pPr>
+      <w:rPr>
+        <w:b/>
+        <w:bCs/>
+      </w:rPr>
+    </w:lvl>
+    <w:lvl w:ilvl="3">
+      <w:start w:val="1"/>
+      <w:numFmt w:val="decimal"/>
+      <w:lvlText w:val="%4."/>
+      <w:lvlJc w:val="left"/>
+      <w:pPr>
+        <w:tabs>
+          <w:tab w:val="num" w:pos="1800"/>
+        </w:tabs>
+        <w:ind w:left="1800" w:hanging="360"/>
+      </w:pPr>
+      <w:rPr>
+        <w:b/>
+        <w:bCs/>
+      </w:rPr>
+    </w:lvl>
+    <w:lvl w:ilvl="4">
+      <w:start w:val="1"/>
+      <w:numFmt w:val="decimal"/>
+      <w:lvlText w:val="%5."/>
+      <w:lvlJc w:val="left"/>
+      <w:pPr>
+        <w:tabs>
+          <w:tab w:val="num" w:pos="2160"/>
+        </w:tabs>
+        <w:ind w:left="2160" w:hanging="360"/>
+      </w:pPr>
+      <w:rPr>
+        <w:b/>
+        <w:bCs/>
+      </w:rPr>
+    </w:lvl>
+    <w:lvl w:ilvl="5">
+      <w:start w:val="1"/>
+      <w:numFmt w:val="decimal"/>
+      <w:lvlText w:val="%6."/>
+      <w:lvlJc w:val="left"/>
+      <w:pPr>
+        <w:tabs>
+          <w:tab w:val="num" w:pos="2520"/>
+        </w:tabs>
+        <w:ind w:left="2520" w:hanging="360"/>
+      </w:pPr>
+      <w:rPr>
+        <w:b/>
+        <w:bCs/>
+      </w:rPr>
+    </w:lvl>
+    <w:lvl w:ilvl="6">
+      <w:start w:val="1"/>
+      <w:numFmt w:val="decimal"/>
+      <w:lvlText w:val="%7."/>
+      <w:lvlJc w:val="left"/>
+      <w:pPr>
+        <w:tabs>
+          <w:tab w:val="num" w:pos="2880"/>
+        </w:tabs>
+        <w:ind w:left="2880" w:hanging="360"/>
+      </w:pPr>
+      <w:rPr>
+        <w:b/>
+        <w:bCs/>
+      </w:rPr>
+    </w:lvl>
+    <w:lvl w:ilvl="7">
+      <w:start w:val="1"/>
+      <w:numFmt w:val="decimal"/>
+      <w:lvlText w:val="%8."/>
+      <w:lvlJc w:val="left"/>
+      <w:pPr>
+        <w:tabs>
+          <w:tab w:val="num" w:pos="3240"/>
+        </w:tabs>
+        <w:ind w:left="3240" w:hanging="360"/>
+      </w:pPr>
+      <w:rPr>
+        <w:b/>
+        <w:bCs/>
+      </w:rPr>
+    </w:lvl>
+    <w:lvl w:ilvl="8">
+      <w:start w:val="1"/>
+      <w:numFmt w:val="decimal"/>
+      <w:lvlText w:val="%9."/>
+      <w:lvlJc w:val="left"/>
+      <w:pPr>
+        <w:tabs>
+          <w:tab w:val="num" w:pos="3600"/>
+        </w:tabs>
+        <w:ind w:left="3600" w:hanging="360"/>
+      </w:pPr>
+      <w:rPr>
+        <w:b/>
+        <w:bCs/>
+      </w:rPr>
+    </w:lvl>
+  </w:abstractNum>
+  <w:abstractNum w:abstractNumId="3">
     <w:lvl w:ilvl="0">
       <w:start w:val="1"/>
       <w:numFmt w:val="none"/>
@@ -3161,6 +2981,9 @@
   </w:num>
   <w:num w:numId="2">
     <w:abstractNumId w:val="2"/>
+  </w:num>
+  <w:num w:numId="3">
+    <w:abstractNumId w:val="3"/>
   </w:num>
 </w:numbering>
 </file>
@@ -4025,6 +3848,14 @@
       <w:rFonts w:ascii="OpenSymbol" w:hAnsi="OpenSymbol" w:eastAsia="OpenSymbol" w:cs="OpenSymbol"/>
     </w:rPr>
   </w:style>
+  <w:style w:type="character" w:styleId="Smbolosdenumerao">
+    <w:name w:val="Símbolos de numeração"/>
+    <w:qFormat/>
+    <w:rPr>
+      <w:b/>
+      <w:bCs/>
+    </w:rPr>
+  </w:style>
   <w:style w:type="paragraph" w:styleId="Ttulo">
     <w:name w:val="Título"/>
     <w:basedOn w:val="Normal"/>

</xml_diff>